<commit_message>
v1.7.12: one-line curl installer
Added curl-install.sh — a self-contained bootstrap that can be run via:
  curl -fsSL https://raw.githubusercontent.com/vasic-digital/claude-toolkit/main/scripts/curl-install.sh | bash

Detects platform, auto-installs missing deps (jq/rsync/awk) via system
package manager, clones/pulls the repo with all submodules, runs install.sh,
and prints next-steps. Idempotent; re-runnable. Install dir overridable
via CLAUDE_TOOLKIT_DIR env var.

Added 22 hermetic tests (test_curl_install.sh) + curl one-liner to README.md.

Verified: run-all.sh 11/11 ALL GREEN; shellcheck 0 on all scripts.

Co-Authored-By: Claude Opus 4.8 (1M context) <noreply@anthropic.com>
</commit_message>
<xml_diff>
--- a/CHANGELOG.docx
+++ b/CHANGELOG.docx
@@ -2,7 +2,7 @@
 <file path=word/document.xml><?xml version="1.0" encoding="utf-8"?>
 <w:document xmlns:w="http://schemas.openxmlformats.org/wordprocessingml/2006/main" xmlns:m="http://schemas.openxmlformats.org/officeDocument/2006/math" xmlns:r="http://schemas.openxmlformats.org/officeDocument/2006/relationships" xmlns:o="urn:schemas-microsoft-com:office:office" xmlns:v="urn:schemas-microsoft-com:vml" xmlns:w10="urn:schemas-microsoft-com:office:word" xmlns:a="http://schemas.openxmlformats.org/drawingml/2006/main" xmlns:pic="http://schemas.openxmlformats.org/drawingml/2006/picture" xmlns:wp="http://schemas.openxmlformats.org/drawingml/2006/wordprocessingDrawing">
   <w:body>
-    <w:bookmarkStart w:id="133" w:name="changelog"/>
+    <w:bookmarkStart w:id="136" w:name="changelog"/>
     <w:p>
       <w:pPr>
         <w:pStyle w:val="Heading1"/>
@@ -19,12 +19,345 @@
         <w:t xml:space="preserve">All notable changes to the Claude multi-account toolkit.</w:t>
       </w:r>
     </w:p>
-    <w:bookmarkStart w:id="12" w:name="X358a773e55ee7916e99f89891cea757a4ef2332"/>
+    <w:bookmarkStart w:id="11" w:name="X68ad3c24b245dcd43387b875fd1f1069901d2ae"/>
     <w:p>
       <w:pPr>
         <w:pStyle w:val="Heading2"/>
       </w:pPr>
       <w:r>
+        <w:t xml:space="preserve">v1.7.12 — 2026-06-28 — One-line curl installer</w:t>
+      </w:r>
+    </w:p>
+    <w:bookmarkStart w:id="9" w:name="added"/>
+    <w:p>
+      <w:pPr>
+        <w:pStyle w:val="Heading3"/>
+      </w:pPr>
+      <w:r>
+        <w:t xml:space="preserve">Added</w:t>
+      </w:r>
+    </w:p>
+    <w:p>
+      <w:pPr>
+        <w:pStyle w:val="Compact"/>
+        <w:numPr>
+          <w:ilvl w:val="0"/>
+          <w:numId w:val="1001"/>
+        </w:numPr>
+      </w:pPr>
+      <w:r>
+        <w:rPr>
+          <w:rStyle w:val="VerbatimChar"/>
+          <w:b/>
+          <w:bCs/>
+        </w:rPr>
+        <w:t xml:space="preserve">curl-install.sh</w:t>
+      </w:r>
+      <w:r>
+        <w:t xml:space="preserve"> </w:t>
+      </w:r>
+      <w:r>
+        <w:t xml:space="preserve">— one-line bootstrap installer:</w:t>
+      </w:r>
+    </w:p>
+    <w:p>
+      <w:pPr>
+        <w:pStyle w:val="SourceCode"/>
+        <w:numPr>
+          <w:ilvl w:val="0"/>
+          <w:numId w:val="1000"/>
+        </w:numPr>
+      </w:pPr>
+      <w:r>
+        <w:rPr>
+          <w:rStyle w:val="ExtensionTok"/>
+        </w:rPr>
+        <w:t xml:space="preserve">curl</w:t>
+      </w:r>
+      <w:r>
+        <w:rPr>
+          <w:rStyle w:val="NormalTok"/>
+        </w:rPr>
+        <w:t xml:space="preserve"> </w:t>
+      </w:r>
+      <w:r>
+        <w:rPr>
+          <w:rStyle w:val="AttributeTok"/>
+        </w:rPr>
+        <w:t xml:space="preserve">-fsSL</w:t>
+      </w:r>
+      <w:r>
+        <w:rPr>
+          <w:rStyle w:val="NormalTok"/>
+        </w:rPr>
+        <w:t xml:space="preserve"> https://raw.githubusercontent.com/vasic-digital/claude-toolkit/main/scripts/curl-install.sh </w:t>
+      </w:r>
+      <w:r>
+        <w:rPr>
+          <w:rStyle w:val="KeywordTok"/>
+        </w:rPr>
+        <w:t xml:space="preserve">|</w:t>
+      </w:r>
+      <w:r>
+        <w:rPr>
+          <w:rStyle w:val="NormalTok"/>
+        </w:rPr>
+        <w:t xml:space="preserve"> </w:t>
+      </w:r>
+      <w:r>
+        <w:rPr>
+          <w:rStyle w:val="FunctionTok"/>
+        </w:rPr>
+        <w:t xml:space="preserve">bash</w:t>
+      </w:r>
+    </w:p>
+    <w:p>
+      <w:pPr>
+        <w:pStyle w:val="Compact"/>
+        <w:numPr>
+          <w:ilvl w:val="0"/>
+          <w:numId w:val="1000"/>
+        </w:numPr>
+      </w:pPr>
+      <w:r>
+        <w:t xml:space="preserve">Detects platform (Linux/macOS) and shell, auto-installs missing hard</w:t>
+      </w:r>
+      <w:r>
+        <w:t xml:space="preserve"> </w:t>
+      </w:r>
+      <w:r>
+        <w:t xml:space="preserve">dependencies (jq, rsync, awk) via the system package manager (apt/dnf/apk/pacman/brew),</w:t>
+      </w:r>
+      <w:r>
+        <w:t xml:space="preserve"> </w:t>
+      </w:r>
+      <w:r>
+        <w:t xml:space="preserve">clones (or pulls if already present) the repo with all submodules recursively to</w:t>
+      </w:r>
+      <w:r>
+        <w:t xml:space="preserve"> </w:t>
+      </w:r>
+      <w:r>
+        <w:rPr>
+          <w:rStyle w:val="VerbatimChar"/>
+        </w:rPr>
+        <w:t xml:space="preserve">~/claude-toolkit</w:t>
+      </w:r>
+      <w:r>
+        <w:t xml:space="preserve">, runs</w:t>
+      </w:r>
+      <w:r>
+        <w:t xml:space="preserve"> </w:t>
+      </w:r>
+      <w:r>
+        <w:rPr>
+          <w:rStyle w:val="VerbatimChar"/>
+        </w:rPr>
+        <w:t xml:space="preserve">install.sh</w:t>
+      </w:r>
+      <w:r>
+        <w:t xml:space="preserve">, and prints next-steps. Idempotent;</w:t>
+      </w:r>
+      <w:r>
+        <w:t xml:space="preserve"> </w:t>
+      </w:r>
+      <w:r>
+        <w:t xml:space="preserve">re-runnable. Install dir overridable via</w:t>
+      </w:r>
+      <w:r>
+        <w:t xml:space="preserve"> </w:t>
+      </w:r>
+      <w:r>
+        <w:rPr>
+          <w:rStyle w:val="VerbatimChar"/>
+        </w:rPr>
+        <w:t xml:space="preserve">CLAUDE_TOOLKIT_DIR</w:t>
+      </w:r>
+      <w:r>
+        <w:t xml:space="preserve"> </w:t>
+      </w:r>
+      <w:r>
+        <w:t xml:space="preserve">env var.</w:t>
+      </w:r>
+    </w:p>
+    <w:p>
+      <w:pPr>
+        <w:pStyle w:val="Compact"/>
+        <w:numPr>
+          <w:ilvl w:val="0"/>
+          <w:numId w:val="1001"/>
+        </w:numPr>
+      </w:pPr>
+      <w:r>
+        <w:rPr>
+          <w:b/>
+          <w:bCs/>
+        </w:rPr>
+        <w:t xml:space="preserve">README.md</w:t>
+      </w:r>
+      <w:r>
+        <w:t xml:space="preserve"> </w:t>
+      </w:r>
+      <w:r>
+        <w:t xml:space="preserve">— curl one-liner added at the top of the Install section.</w:t>
+      </w:r>
+    </w:p>
+    <w:p>
+      <w:pPr>
+        <w:pStyle w:val="Compact"/>
+        <w:numPr>
+          <w:ilvl w:val="0"/>
+          <w:numId w:val="1001"/>
+        </w:numPr>
+      </w:pPr>
+      <w:r>
+        <w:rPr>
+          <w:rStyle w:val="VerbatimChar"/>
+          <w:b/>
+          <w:bCs/>
+        </w:rPr>
+        <w:t xml:space="preserve">test_curl_install.sh</w:t>
+      </w:r>
+      <w:r>
+        <w:t xml:space="preserve"> </w:t>
+      </w:r>
+      <w:r>
+        <w:t xml:space="preserve">— 22 hermetic tests covering syntax, permissions,</w:t>
+      </w:r>
+      <w:r>
+        <w:t xml:space="preserve"> </w:t>
+      </w:r>
+      <w:r>
+        <w:t xml:space="preserve">URL correctness, submodule cloning, idempotency, platform detection, dependency</w:t>
+      </w:r>
+      <w:r>
+        <w:t xml:space="preserve"> </w:t>
+      </w:r>
+      <w:r>
+        <w:t xml:space="preserve">checks, error handling, and next-steps output.</w:t>
+      </w:r>
+    </w:p>
+    <w:bookmarkEnd w:id="9"/>
+    <w:bookmarkStart w:id="10" w:name="verified"/>
+    <w:p>
+      <w:pPr>
+        <w:pStyle w:val="Heading3"/>
+      </w:pPr>
+      <w:r>
+        <w:t xml:space="preserve">Verified</w:t>
+      </w:r>
+    </w:p>
+    <w:p>
+      <w:pPr>
+        <w:pStyle w:val="Compact"/>
+        <w:numPr>
+          <w:ilvl w:val="0"/>
+          <w:numId w:val="1002"/>
+        </w:numPr>
+      </w:pPr>
+      <w:r>
+        <w:rPr>
+          <w:rStyle w:val="VerbatimChar"/>
+        </w:rPr>
+        <w:t xml:space="preserve">bash -n</w:t>
+      </w:r>
+      <w:r>
+        <w:t xml:space="preserve"> </w:t>
+      </w:r>
+      <w:r>
+        <w:t xml:space="preserve">+</w:t>
+      </w:r>
+      <w:r>
+        <w:t xml:space="preserve"> </w:t>
+      </w:r>
+      <w:r>
+        <w:rPr>
+          <w:rStyle w:val="VerbatimChar"/>
+        </w:rPr>
+        <w:t xml:space="preserve">shellcheck 0</w:t>
+      </w:r>
+      <w:r>
+        <w:t xml:space="preserve"> </w:t>
+      </w:r>
+      <w:r>
+        <w:t xml:space="preserve">on</w:t>
+      </w:r>
+      <w:r>
+        <w:t xml:space="preserve"> </w:t>
+      </w:r>
+      <w:r>
+        <w:rPr>
+          <w:rStyle w:val="VerbatimChar"/>
+        </w:rPr>
+        <w:t xml:space="preserve">curl-install.sh</w:t>
+      </w:r>
+      <w:r>
+        <w:t xml:space="preserve"> </w:t>
+      </w:r>
+      <w:r>
+        <w:t xml:space="preserve">and</w:t>
+      </w:r>
+      <w:r>
+        <w:t xml:space="preserve"> </w:t>
+      </w:r>
+      <w:r>
+        <w:rPr>
+          <w:rStyle w:val="VerbatimChar"/>
+        </w:rPr>
+        <w:t xml:space="preserve">test_curl_install.sh</w:t>
+      </w:r>
+      <w:r>
+        <w:t xml:space="preserve">.</w:t>
+      </w:r>
+    </w:p>
+    <w:p>
+      <w:pPr>
+        <w:pStyle w:val="Compact"/>
+        <w:numPr>
+          <w:ilvl w:val="0"/>
+          <w:numId w:val="1002"/>
+        </w:numPr>
+      </w:pPr>
+      <w:r>
+        <w:rPr>
+          <w:rStyle w:val="VerbatimChar"/>
+        </w:rPr>
+        <w:t xml:space="preserve">run-all.sh</w:t>
+      </w:r>
+      <w:r>
+        <w:t xml:space="preserve"> </w:t>
+      </w:r>
+      <w:r>
+        <w:rPr>
+          <w:b/>
+          <w:bCs/>
+        </w:rPr>
+        <w:t xml:space="preserve">11/11 ALL GREEN</w:t>
+      </w:r>
+      <w:r>
+        <w:t xml:space="preserve"> </w:t>
+      </w:r>
+      <w:r>
+        <w:t xml:space="preserve">(was 10; +</w:t>
+      </w:r>
+      <w:r>
+        <w:rPr>
+          <w:rStyle w:val="VerbatimChar"/>
+        </w:rPr>
+        <w:t xml:space="preserve">test_curl_install.sh</w:t>
+      </w:r>
+      <w:r>
+        <w:t xml:space="preserve">).</w:t>
+      </w:r>
+    </w:p>
+    <w:bookmarkEnd w:id="10"/>
+    <w:bookmarkEnd w:id="11"/>
+    <w:bookmarkStart w:id="15" w:name="X358a773e55ee7916e99f89891cea757a4ef2332"/>
+    <w:p>
+      <w:pPr>
+        <w:pStyle w:val="Heading2"/>
+      </w:pPr>
+      <w:r>
         <w:t xml:space="preserve">v1.7.11 — 2026-06-28 — Round-4: coverage-gap regression tests, toon recursion guard, arg validation</w:t>
       </w:r>
     </w:p>
@@ -54,7 +387,7 @@
         <w:t xml:space="preserve">ship; plus 2 LOW code findings.</w:t>
       </w:r>
     </w:p>
-    <w:bookmarkStart w:id="9" w:name="fixed"/>
+    <w:bookmarkStart w:id="12" w:name="fixed"/>
     <w:p>
       <w:pPr>
         <w:pStyle w:val="Heading3"/>
@@ -68,7 +401,7 @@
         <w:pStyle w:val="Compact"/>
         <w:numPr>
           <w:ilvl w:val="0"/>
-          <w:numId w:val="1001"/>
+          <w:numId w:val="1003"/>
         </w:numPr>
       </w:pPr>
       <w:r>
@@ -136,7 +469,7 @@
         <w:pStyle w:val="Compact"/>
         <w:numPr>
           <w:ilvl w:val="0"/>
-          <w:numId w:val="1001"/>
+          <w:numId w:val="1003"/>
         </w:numPr>
       </w:pPr>
       <w:r>
@@ -234,8 +567,8 @@
         <w:t xml:space="preserve">+ exit 1.</w:t>
       </w:r>
     </w:p>
-    <w:bookmarkEnd w:id="9"/>
-    <w:bookmarkStart w:id="10" w:name="Xa3820b20d9de08dfbf04e844ba6fdc48d6e2898"/>
+    <w:bookmarkEnd w:id="12"/>
+    <w:bookmarkStart w:id="13" w:name="Xa3820b20d9de08dfbf04e844ba6fdc48d6e2898"/>
     <w:p>
       <w:pPr>
         <w:pStyle w:val="Heading3"/>
@@ -257,7 +590,7 @@
         <w:pStyle w:val="Compact"/>
         <w:numPr>
           <w:ilvl w:val="0"/>
-          <w:numId w:val="1002"/>
+          <w:numId w:val="1004"/>
         </w:numPr>
       </w:pPr>
       <w:r>
@@ -398,7 +731,7 @@
         <w:pStyle w:val="Compact"/>
         <w:numPr>
           <w:ilvl w:val="0"/>
-          <w:numId w:val="1002"/>
+          <w:numId w:val="1004"/>
         </w:numPr>
       </w:pPr>
       <w:r>
@@ -512,7 +845,7 @@
         <w:pStyle w:val="Compact"/>
         <w:numPr>
           <w:ilvl w:val="0"/>
-          <w:numId w:val="1002"/>
+          <w:numId w:val="1004"/>
         </w:numPr>
       </w:pPr>
       <w:r>
@@ -597,7 +930,7 @@
         <w:pStyle w:val="Compact"/>
         <w:numPr>
           <w:ilvl w:val="0"/>
-          <w:numId w:val="1002"/>
+          <w:numId w:val="1004"/>
         </w:numPr>
       </w:pPr>
       <w:r>
@@ -673,7 +1006,7 @@
         <w:pStyle w:val="Compact"/>
         <w:numPr>
           <w:ilvl w:val="0"/>
-          <w:numId w:val="1002"/>
+          <w:numId w:val="1004"/>
         </w:numPr>
       </w:pPr>
       <w:r>
@@ -767,8 +1100,8 @@
         <w:t xml:space="preserve">, asserts that one wins.</w:t>
       </w:r>
     </w:p>
-    <w:bookmarkEnd w:id="10"/>
-    <w:bookmarkStart w:id="11" w:name="verified"/>
+    <w:bookmarkEnd w:id="13"/>
+    <w:bookmarkStart w:id="14" w:name="verified-1"/>
     <w:p>
       <w:pPr>
         <w:pStyle w:val="Heading3"/>
@@ -782,7 +1115,7 @@
         <w:pStyle w:val="Compact"/>
         <w:numPr>
           <w:ilvl w:val="0"/>
-          <w:numId w:val="1003"/>
+          <w:numId w:val="1005"/>
         </w:numPr>
       </w:pPr>
       <w:r>
@@ -875,9 +1208,9 @@
         <w:t xml:space="preserve">toon.mjs missing-arg gives clean error + exit 1.</w:t>
       </w:r>
     </w:p>
-    <w:bookmarkEnd w:id="11"/>
-    <w:bookmarkEnd w:id="12"/>
-    <w:bookmarkStart w:id="18" w:name="X8a3bd46d32a35a5c1c9419ff9ea303d5d467afa"/>
+    <w:bookmarkEnd w:id="14"/>
+    <w:bookmarkEnd w:id="15"/>
+    <w:bookmarkStart w:id="21" w:name="X8a3bd46d32a35a5c1c9419ff9ea303d5d467afa"/>
     <w:p>
       <w:pPr>
         <w:pStyle w:val="Heading2"/>
@@ -900,7 +1233,7 @@
         <w:t xml:space="preserve">claude-unify merge, the poe proxy, bootstrap). Fixes verified centrally.</w:t>
       </w:r>
     </w:p>
-    <w:bookmarkStart w:id="13" w:name="fixed-1"/>
+    <w:bookmarkStart w:id="16" w:name="fixed-1"/>
     <w:p>
       <w:pPr>
         <w:pStyle w:val="Heading3"/>
@@ -914,7 +1247,7 @@
         <w:pStyle w:val="Compact"/>
         <w:numPr>
           <w:ilvl w:val="0"/>
-          <w:numId w:val="1004"/>
+          <w:numId w:val="1006"/>
         </w:numPr>
       </w:pPr>
       <w:r>
@@ -1130,8 +1463,8 @@
         <w:t xml:space="preserve">(was empty); a ≥3-plugin regression test was added.</w:t>
       </w:r>
     </w:p>
-    <w:bookmarkEnd w:id="13"/>
-    <w:bookmarkStart w:id="14" w:name="security-defense-in-depth"/>
+    <w:bookmarkEnd w:id="16"/>
+    <w:bookmarkStart w:id="17" w:name="security-defense-in-depth"/>
     <w:p>
       <w:pPr>
         <w:pStyle w:val="Heading3"/>
@@ -1145,7 +1478,7 @@
         <w:pStyle w:val="Compact"/>
         <w:numPr>
           <w:ilvl w:val="0"/>
-          <w:numId w:val="1005"/>
+          <w:numId w:val="1007"/>
         </w:numPr>
       </w:pPr>
       <w:r>
@@ -1293,7 +1626,7 @@
         <w:pStyle w:val="Compact"/>
         <w:numPr>
           <w:ilvl w:val="0"/>
-          <w:numId w:val="1005"/>
+          <w:numId w:val="1007"/>
         </w:numPr>
       </w:pPr>
       <w:r>
@@ -1390,7 +1723,7 @@
         <w:pStyle w:val="Compact"/>
         <w:numPr>
           <w:ilvl w:val="0"/>
-          <w:numId w:val="1005"/>
+          <w:numId w:val="1007"/>
         </w:numPr>
       </w:pPr>
       <w:r>
@@ -1443,8 +1776,8 @@
         <w:t xml:space="preserve">clear error instead of a broken alias.</w:t>
       </w:r>
     </w:p>
-    <w:bookmarkEnd w:id="14"/>
-    <w:bookmarkStart w:id="15" w:name="robustness"/>
+    <w:bookmarkEnd w:id="17"/>
+    <w:bookmarkStart w:id="18" w:name="robustness"/>
     <w:p>
       <w:pPr>
         <w:pStyle w:val="Heading3"/>
@@ -1458,7 +1791,7 @@
         <w:pStyle w:val="Compact"/>
         <w:numPr>
           <w:ilvl w:val="0"/>
-          <w:numId w:val="1006"/>
+          <w:numId w:val="1008"/>
         </w:numPr>
       </w:pPr>
       <w:r>
@@ -1542,8 +1875,8 @@
         <w:t xml:space="preserve">gzip body no longer propagates.</w:t>
       </w:r>
     </w:p>
-    <w:bookmarkEnd w:id="15"/>
-    <w:bookmarkStart w:id="16" w:name="verified-1"/>
+    <w:bookmarkEnd w:id="18"/>
+    <w:bookmarkStart w:id="19" w:name="verified-2"/>
     <w:p>
       <w:pPr>
         <w:pStyle w:val="Heading3"/>
@@ -1557,7 +1890,7 @@
         <w:pStyle w:val="Compact"/>
         <w:numPr>
           <w:ilvl w:val="0"/>
-          <w:numId w:val="1007"/>
+          <w:numId w:val="1009"/>
         </w:numPr>
       </w:pPr>
       <w:r>
@@ -1640,7 +1973,7 @@
         <w:pStyle w:val="Compact"/>
         <w:numPr>
           <w:ilvl w:val="0"/>
-          <w:numId w:val="1007"/>
+          <w:numId w:val="1009"/>
         </w:numPr>
       </w:pPr>
       <w:r>
@@ -1680,8 +2013,8 @@
         <w:t xml:space="preserve">write path is unchanged from v1.7.9's live-proven 137 models / 32 aliases.</w:t>
       </w:r>
     </w:p>
-    <w:bookmarkEnd w:id="16"/>
-    <w:bookmarkStart w:id="17" w:name="audit-round-3--verified-clean"/>
+    <w:bookmarkEnd w:id="19"/>
+    <w:bookmarkStart w:id="20" w:name="audit-round-3--verified-clean"/>
     <w:p>
       <w:pPr>
         <w:pStyle w:val="Heading3"/>
@@ -1782,9 +2115,9 @@
         <w:t xml:space="preserve">intentionally bypasses the needs-secret guard — operator opt-in, documented.)</w:t>
       </w:r>
     </w:p>
-    <w:bookmarkEnd w:id="17"/>
-    <w:bookmarkEnd w:id="18"/>
-    <w:bookmarkStart w:id="24" w:name="X3f745f2f1363b5cbfd7fbe71d4044eac102974b"/>
+    <w:bookmarkEnd w:id="20"/>
+    <w:bookmarkEnd w:id="21"/>
+    <w:bookmarkStart w:id="27" w:name="X3f745f2f1363b5cbfd7fbe71d4044eac102974b"/>
     <w:p>
       <w:pPr>
         <w:pStyle w:val="Heading2"/>
@@ -1807,7 +2140,7 @@
         <w:t xml:space="preserve">security audit + doc-accuracy audit + lint sweep, fixes verified centrally).</w:t>
       </w:r>
     </w:p>
-    <w:bookmarkStart w:id="19" w:name="security"/>
+    <w:bookmarkStart w:id="22" w:name="security"/>
     <w:p>
       <w:pPr>
         <w:pStyle w:val="Heading3"/>
@@ -1821,7 +2154,7 @@
         <w:pStyle w:val="Compact"/>
         <w:numPr>
           <w:ilvl w:val="0"/>
-          <w:numId w:val="1008"/>
+          <w:numId w:val="1010"/>
         </w:numPr>
       </w:pPr>
       <w:r>
@@ -1991,7 +2324,7 @@
         <w:pStyle w:val="Compact"/>
         <w:numPr>
           <w:ilvl w:val="0"/>
-          <w:numId w:val="1008"/>
+          <w:numId w:val="1010"/>
         </w:numPr>
       </w:pPr>
       <w:r>
@@ -2097,7 +2430,7 @@
         <w:pStyle w:val="Compact"/>
         <w:numPr>
           <w:ilvl w:val="0"/>
-          <w:numId w:val="1008"/>
+          <w:numId w:val="1010"/>
         </w:numPr>
       </w:pPr>
       <w:r>
@@ -2218,7 +2551,7 @@
         <w:pStyle w:val="Compact"/>
         <w:numPr>
           <w:ilvl w:val="0"/>
-          <w:numId w:val="1008"/>
+          <w:numId w:val="1010"/>
         </w:numPr>
       </w:pPr>
       <w:r>
@@ -2297,7 +2630,7 @@
         <w:pStyle w:val="Compact"/>
         <w:numPr>
           <w:ilvl w:val="0"/>
-          <w:numId w:val="1008"/>
+          <w:numId w:val="1010"/>
         </w:numPr>
       </w:pPr>
       <w:r>
@@ -2458,8 +2791,8 @@
         <w:t xml:space="preserve">original six-name allowlist.</w:t>
       </w:r>
     </w:p>
-    <w:bookmarkEnd w:id="19"/>
-    <w:bookmarkStart w:id="20" w:name="fixed-2"/>
+    <w:bookmarkEnd w:id="22"/>
+    <w:bookmarkStart w:id="23" w:name="fixed-2"/>
     <w:p>
       <w:pPr>
         <w:pStyle w:val="Heading3"/>
@@ -2473,7 +2806,7 @@
         <w:pStyle w:val="Compact"/>
         <w:numPr>
           <w:ilvl w:val="0"/>
-          <w:numId w:val="1009"/>
+          <w:numId w:val="1011"/>
         </w:numPr>
       </w:pPr>
       <w:r>
@@ -2573,7 +2906,7 @@
         <w:pStyle w:val="Compact"/>
         <w:numPr>
           <w:ilvl w:val="0"/>
-          <w:numId w:val="1009"/>
+          <w:numId w:val="1011"/>
         </w:numPr>
       </w:pPr>
       <w:r>
@@ -2619,7 +2952,7 @@
         <w:pStyle w:val="Compact"/>
         <w:numPr>
           <w:ilvl w:val="0"/>
-          <w:numId w:val="1009"/>
+          <w:numId w:val="1011"/>
         </w:numPr>
       </w:pPr>
       <w:r>
@@ -2728,8 +3061,8 @@
         <w:t xml:space="preserve">.</w:t>
       </w:r>
     </w:p>
-    <w:bookmarkEnd w:id="20"/>
-    <w:bookmarkStart w:id="21" w:name="docs"/>
+    <w:bookmarkEnd w:id="23"/>
+    <w:bookmarkStart w:id="24" w:name="docs"/>
     <w:p>
       <w:pPr>
         <w:pStyle w:val="Heading3"/>
@@ -2743,7 +3076,7 @@
         <w:pStyle w:val="Compact"/>
         <w:numPr>
           <w:ilvl w:val="0"/>
-          <w:numId w:val="1010"/>
+          <w:numId w:val="1012"/>
         </w:numPr>
       </w:pPr>
       <w:r>
@@ -2879,8 +3212,8 @@
         <w:t xml:space="preserve">refreshed date stamp.</w:t>
       </w:r>
     </w:p>
-    <w:bookmarkEnd w:id="21"/>
-    <w:bookmarkStart w:id="22" w:name="quality"/>
+    <w:bookmarkEnd w:id="24"/>
+    <w:bookmarkStart w:id="25" w:name="quality"/>
     <w:p>
       <w:pPr>
         <w:pStyle w:val="Heading3"/>
@@ -2894,7 +3227,7 @@
         <w:pStyle w:val="Compact"/>
         <w:numPr>
           <w:ilvl w:val="0"/>
-          <w:numId w:val="1011"/>
+          <w:numId w:val="1013"/>
         </w:numPr>
       </w:pPr>
       <w:r>
@@ -2959,8 +3292,8 @@
         <w:t xml:space="preserve">the one remaining reserved no-op flag carries a justified inline disable.</w:t>
       </w:r>
     </w:p>
-    <w:bookmarkEnd w:id="22"/>
-    <w:bookmarkStart w:id="23" w:name="verified-2"/>
+    <w:bookmarkEnd w:id="25"/>
+    <w:bookmarkStart w:id="26" w:name="verified-3"/>
     <w:p>
       <w:pPr>
         <w:pStyle w:val="Heading3"/>
@@ -2974,7 +3307,7 @@
         <w:pStyle w:val="Compact"/>
         <w:numPr>
           <w:ilvl w:val="0"/>
-          <w:numId w:val="1012"/>
+          <w:numId w:val="1014"/>
         </w:numPr>
       </w:pPr>
       <w:r>
@@ -3042,7 +3375,7 @@
         <w:pStyle w:val="Compact"/>
         <w:numPr>
           <w:ilvl w:val="0"/>
-          <w:numId w:val="1012"/>
+          <w:numId w:val="1014"/>
         </w:numPr>
       </w:pPr>
       <w:r>
@@ -3096,7 +3429,7 @@
         <w:pStyle w:val="Compact"/>
         <w:numPr>
           <w:ilvl w:val="0"/>
-          <w:numId w:val="1012"/>
+          <w:numId w:val="1014"/>
         </w:numPr>
       </w:pPr>
       <w:r>
@@ -3166,16 +3499,16 @@
         <w:pStyle w:val="Compact"/>
         <w:numPr>
           <w:ilvl w:val="0"/>
-          <w:numId w:val="1012"/>
+          <w:numId w:val="1014"/>
         </w:numPr>
       </w:pPr>
       <w:r>
         <w:t xml:space="preserve">4-host byte-parity + 10/10 suite re-verified after deploy.</w:t>
       </w:r>
     </w:p>
-    <w:bookmarkEnd w:id="23"/>
-    <w:bookmarkEnd w:id="24"/>
-    <w:bookmarkStart w:id="29" w:name="X32f4e63b5b469270c24eeebf0670d89dbf8d175"/>
+    <w:bookmarkEnd w:id="26"/>
+    <w:bookmarkEnd w:id="27"/>
+    <w:bookmarkStart w:id="32" w:name="X32f4e63b5b469270c24eeebf0670d89dbf8d175"/>
     <w:p>
       <w:pPr>
         <w:pStyle w:val="Heading2"/>
@@ -3204,7 +3537,7 @@
         <w:t xml:space="preserve">suite + live multi-model verification were run centrally.</w:t>
       </w:r>
     </w:p>
-    <w:bookmarkStart w:id="25" w:name="security-1"/>
+    <w:bookmarkStart w:id="28" w:name="security-1"/>
     <w:p>
       <w:pPr>
         <w:pStyle w:val="Heading3"/>
@@ -3218,7 +3551,7 @@
         <w:pStyle w:val="Compact"/>
         <w:numPr>
           <w:ilvl w:val="0"/>
-          <w:numId w:val="1013"/>
+          <w:numId w:val="1015"/>
         </w:numPr>
       </w:pPr>
       <w:r>
@@ -3405,7 +3738,7 @@
         <w:pStyle w:val="Compact"/>
         <w:numPr>
           <w:ilvl w:val="0"/>
-          <w:numId w:val="1013"/>
+          <w:numId w:val="1015"/>
         </w:numPr>
       </w:pPr>
       <w:r>
@@ -3561,7 +3894,7 @@
         <w:pStyle w:val="Compact"/>
         <w:numPr>
           <w:ilvl w:val="0"/>
-          <w:numId w:val="1013"/>
+          <w:numId w:val="1015"/>
         </w:numPr>
       </w:pPr>
       <w:r>
@@ -3720,8 +4053,8 @@
         <w:t xml:space="preserve">on all four remotes.</w:t>
       </w:r>
     </w:p>
-    <w:bookmarkEnd w:id="25"/>
-    <w:bookmarkStart w:id="26" w:name="fixed-3"/>
+    <w:bookmarkEnd w:id="28"/>
+    <w:bookmarkStart w:id="29" w:name="fixed-3"/>
     <w:p>
       <w:pPr>
         <w:pStyle w:val="Heading3"/>
@@ -3735,7 +4068,7 @@
         <w:pStyle w:val="Compact"/>
         <w:numPr>
           <w:ilvl w:val="0"/>
-          <w:numId w:val="1014"/>
+          <w:numId w:val="1016"/>
         </w:numPr>
       </w:pPr>
       <w:r>
@@ -3821,7 +4154,7 @@
         <w:pStyle w:val="Compact"/>
         <w:numPr>
           <w:ilvl w:val="0"/>
-          <w:numId w:val="1014"/>
+          <w:numId w:val="1016"/>
         </w:numPr>
       </w:pPr>
       <w:r>
@@ -3944,7 +4277,7 @@
         <w:pStyle w:val="Compact"/>
         <w:numPr>
           <w:ilvl w:val="0"/>
-          <w:numId w:val="1014"/>
+          <w:numId w:val="1016"/>
         </w:numPr>
       </w:pPr>
       <w:r>
@@ -4023,7 +4356,7 @@
         <w:pStyle w:val="Compact"/>
         <w:numPr>
           <w:ilvl w:val="0"/>
-          <w:numId w:val="1014"/>
+          <w:numId w:val="1016"/>
         </w:numPr>
       </w:pPr>
       <w:r>
@@ -4083,8 +4416,8 @@
         <w:t xml:space="preserve">).</w:t>
       </w:r>
     </w:p>
-    <w:bookmarkEnd w:id="26"/>
-    <w:bookmarkStart w:id="27" w:name="added"/>
+    <w:bookmarkEnd w:id="29"/>
+    <w:bookmarkStart w:id="30" w:name="added-1"/>
     <w:p>
       <w:pPr>
         <w:pStyle w:val="Heading3"/>
@@ -4098,7 +4431,7 @@
         <w:pStyle w:val="Compact"/>
         <w:numPr>
           <w:ilvl w:val="0"/>
-          <w:numId w:val="1015"/>
+          <w:numId w:val="1017"/>
         </w:numPr>
       </w:pPr>
       <w:r>
@@ -4283,7 +4616,7 @@
         <w:pStyle w:val="Compact"/>
         <w:numPr>
           <w:ilvl w:val="0"/>
-          <w:numId w:val="1015"/>
+          <w:numId w:val="1017"/>
         </w:numPr>
       </w:pPr>
       <w:r>
@@ -4351,8 +4684,8 @@
         <w:t xml:space="preserve">a failure never re-echoes a secret.</w:t>
       </w:r>
     </w:p>
-    <w:bookmarkEnd w:id="27"/>
-    <w:bookmarkStart w:id="28" w:name="verified-3"/>
+    <w:bookmarkEnd w:id="30"/>
+    <w:bookmarkStart w:id="31" w:name="verified-4"/>
     <w:p>
       <w:pPr>
         <w:pStyle w:val="Heading3"/>
@@ -4366,7 +4699,7 @@
         <w:pStyle w:val="Compact"/>
         <w:numPr>
           <w:ilvl w:val="0"/>
-          <w:numId w:val="1016"/>
+          <w:numId w:val="1018"/>
         </w:numPr>
       </w:pPr>
       <w:r>
@@ -4412,7 +4745,7 @@
         <w:pStyle w:val="Compact"/>
         <w:numPr>
           <w:ilvl w:val="0"/>
-          <w:numId w:val="1016"/>
+          <w:numId w:val="1018"/>
         </w:numPr>
       </w:pPr>
       <w:r>
@@ -4500,7 +4833,7 @@
         <w:pStyle w:val="Compact"/>
         <w:numPr>
           <w:ilvl w:val="0"/>
-          <w:numId w:val="1016"/>
+          <w:numId w:val="1018"/>
         </w:numPr>
       </w:pPr>
       <w:r>
@@ -4554,7 +4887,7 @@
         <w:pStyle w:val="Compact"/>
         <w:numPr>
           <w:ilvl w:val="0"/>
-          <w:numId w:val="1016"/>
+          <w:numId w:val="1018"/>
         </w:numPr>
       </w:pPr>
       <w:r>
@@ -4597,9 +4930,9 @@
         <w:t xml:space="preserve">.</w:t>
       </w:r>
     </w:p>
-    <w:bookmarkEnd w:id="28"/>
-    <w:bookmarkEnd w:id="29"/>
-    <w:bookmarkStart w:id="34" w:name="X3dc7a22e845e8a16dcec7ab3494aa6e579b0408"/>
+    <w:bookmarkEnd w:id="31"/>
+    <w:bookmarkEnd w:id="32"/>
+    <w:bookmarkStart w:id="37" w:name="X3dc7a22e845e8a16dcec7ab3494aa6e579b0408"/>
     <w:p>
       <w:pPr>
         <w:pStyle w:val="Heading2"/>
@@ -4616,7 +4949,7 @@
         <w:t xml:space="preserve">Follow-up hardening release found by a parallel multi-agent audit of v1.7.6.</w:t>
       </w:r>
     </w:p>
-    <w:bookmarkStart w:id="30" w:name="fixed-4"/>
+    <w:bookmarkStart w:id="33" w:name="fixed-4"/>
     <w:p>
       <w:pPr>
         <w:pStyle w:val="Heading3"/>
@@ -4630,7 +4963,7 @@
         <w:pStyle w:val="Compact"/>
         <w:numPr>
           <w:ilvl w:val="0"/>
-          <w:numId w:val="1017"/>
+          <w:numId w:val="1019"/>
         </w:numPr>
       </w:pPr>
       <w:r>
@@ -4933,7 +5266,7 @@
         <w:pStyle w:val="Compact"/>
         <w:numPr>
           <w:ilvl w:val="0"/>
-          <w:numId w:val="1017"/>
+          <w:numId w:val="1019"/>
         </w:numPr>
       </w:pPr>
       <w:r>
@@ -5061,8 +5394,8 @@
         <w:t xml:space="preserve">.</w:t>
       </w:r>
     </w:p>
-    <w:bookmarkEnd w:id="30"/>
-    <w:bookmarkStart w:id="31" w:name="added-1"/>
+    <w:bookmarkEnd w:id="33"/>
+    <w:bookmarkStart w:id="34" w:name="added-2"/>
     <w:p>
       <w:pPr>
         <w:pStyle w:val="Heading3"/>
@@ -5076,7 +5409,7 @@
         <w:pStyle w:val="Compact"/>
         <w:numPr>
           <w:ilvl w:val="0"/>
-          <w:numId w:val="1018"/>
+          <w:numId w:val="1020"/>
         </w:numPr>
       </w:pPr>
       <w:r>
@@ -5111,7 +5444,7 @@
         <w:pStyle w:val="Compact"/>
         <w:numPr>
           <w:ilvl w:val="0"/>
-          <w:numId w:val="1018"/>
+          <w:numId w:val="1020"/>
         </w:numPr>
       </w:pPr>
       <w:r>
@@ -5180,8 +5513,8 @@
         <w:t xml:space="preserve">.</w:t>
       </w:r>
     </w:p>
-    <w:bookmarkEnd w:id="31"/>
-    <w:bookmarkStart w:id="32" w:name="verified-4"/>
+    <w:bookmarkEnd w:id="34"/>
+    <w:bookmarkStart w:id="35" w:name="verified-5"/>
     <w:p>
       <w:pPr>
         <w:pStyle w:val="Heading3"/>
@@ -5195,7 +5528,7 @@
         <w:pStyle w:val="Compact"/>
         <w:numPr>
           <w:ilvl w:val="0"/>
-          <w:numId w:val="1019"/>
+          <w:numId w:val="1021"/>
         </w:numPr>
       </w:pPr>
       <w:r>
@@ -5235,7 +5568,7 @@
         <w:pStyle w:val="Compact"/>
         <w:numPr>
           <w:ilvl w:val="0"/>
-          <w:numId w:val="1019"/>
+          <w:numId w:val="1021"/>
         </w:numPr>
       </w:pPr>
       <w:r>
@@ -5266,8 +5599,8 @@
         <w:t xml:space="preserve">on macOS.</w:t>
       </w:r>
     </w:p>
-    <w:bookmarkEnd w:id="32"/>
-    <w:bookmarkStart w:id="33" w:name="X62b0a64b7c3ea8cc9486d03458dca15977de730"/>
+    <w:bookmarkEnd w:id="35"/>
+    <w:bookmarkStart w:id="36" w:name="X62b0a64b7c3ea8cc9486d03458dca15977de730"/>
     <w:p>
       <w:pPr>
         <w:pStyle w:val="Heading3"/>
@@ -5281,7 +5614,7 @@
         <w:pStyle w:val="Compact"/>
         <w:numPr>
           <w:ilvl w:val="0"/>
-          <w:numId w:val="1020"/>
+          <w:numId w:val="1022"/>
         </w:numPr>
       </w:pPr>
       <w:r>
@@ -5329,7 +5662,7 @@
         <w:pStyle w:val="Compact"/>
         <w:numPr>
           <w:ilvl w:val="0"/>
-          <w:numId w:val="1020"/>
+          <w:numId w:val="1022"/>
         </w:numPr>
       </w:pPr>
       <w:r>
@@ -5383,7 +5716,7 @@
         <w:pStyle w:val="Compact"/>
         <w:numPr>
           <w:ilvl w:val="0"/>
-          <w:numId w:val="1020"/>
+          <w:numId w:val="1022"/>
         </w:numPr>
       </w:pPr>
       <w:r>
@@ -5401,7 +5734,7 @@
         <w:pStyle w:val="Compact"/>
         <w:numPr>
           <w:ilvl w:val="0"/>
-          <w:numId w:val="1020"/>
+          <w:numId w:val="1022"/>
         </w:numPr>
       </w:pPr>
       <w:r>
@@ -5444,9 +5777,9 @@
         <w:t xml:space="preserve">needs a force tag push; left for a maintainer decision.</w:t>
       </w:r>
     </w:p>
-    <w:bookmarkEnd w:id="33"/>
-    <w:bookmarkEnd w:id="34"/>
-    <w:bookmarkStart w:id="39" w:name="X5bab4cefc6082b36259bdda3d0e046856fdd451"/>
+    <w:bookmarkEnd w:id="36"/>
+    <w:bookmarkEnd w:id="37"/>
+    <w:bookmarkStart w:id="42" w:name="X5bab4cefc6082b36259bdda3d0e046856fdd451"/>
     <w:p>
       <w:pPr>
         <w:pStyle w:val="Heading2"/>
@@ -5455,7 +5788,7 @@
         <w:t xml:space="preserve">v1.7.6 — 2026-06-28 — Always-non-interactive execution, alias-file integrity, macOS/bash-3.2 portability, 4-host rollout</w:t>
       </w:r>
     </w:p>
-    <w:bookmarkStart w:id="35" w:name="fixed-5"/>
+    <w:bookmarkStart w:id="38" w:name="fixed-5"/>
     <w:p>
       <w:pPr>
         <w:pStyle w:val="Heading3"/>
@@ -5469,7 +5802,7 @@
         <w:pStyle w:val="Compact"/>
         <w:numPr>
           <w:ilvl w:val="0"/>
-          <w:numId w:val="1021"/>
+          <w:numId w:val="1023"/>
         </w:numPr>
       </w:pPr>
       <w:r>
@@ -5719,7 +6052,7 @@
         <w:pStyle w:val="Compact"/>
         <w:numPr>
           <w:ilvl w:val="0"/>
-          <w:numId w:val="1021"/>
+          <w:numId w:val="1023"/>
         </w:numPr>
       </w:pPr>
       <w:r>
@@ -5911,7 +6244,7 @@
         <w:pStyle w:val="Compact"/>
         <w:numPr>
           <w:ilvl w:val="0"/>
-          <w:numId w:val="1021"/>
+          <w:numId w:val="1023"/>
         </w:numPr>
       </w:pPr>
       <w:r>
@@ -6061,8 +6394,8 @@
         <w:t xml:space="preserve">are unbound on bash 3.2). The suite now runs green on macOS bash 3.2.</w:t>
       </w:r>
     </w:p>
-    <w:bookmarkEnd w:id="35"/>
-    <w:bookmarkStart w:id="36" w:name="added-2"/>
+    <w:bookmarkEnd w:id="38"/>
+    <w:bookmarkStart w:id="39" w:name="added-3"/>
     <w:p>
       <w:pPr>
         <w:pStyle w:val="Heading3"/>
@@ -6076,7 +6409,7 @@
         <w:pStyle w:val="Compact"/>
         <w:numPr>
           <w:ilvl w:val="0"/>
-          <w:numId w:val="1022"/>
+          <w:numId w:val="1024"/>
         </w:numPr>
       </w:pPr>
       <w:r>
@@ -6234,7 +6567,7 @@
         <w:pStyle w:val="Compact"/>
         <w:numPr>
           <w:ilvl w:val="0"/>
-          <w:numId w:val="1022"/>
+          <w:numId w:val="1024"/>
         </w:numPr>
       </w:pPr>
       <w:r>
@@ -6277,7 +6610,7 @@
         <w:pStyle w:val="Compact"/>
         <w:numPr>
           <w:ilvl w:val="0"/>
-          <w:numId w:val="1022"/>
+          <w:numId w:val="1024"/>
         </w:numPr>
       </w:pPr>
       <w:r>
@@ -6315,8 +6648,8 @@
         <w:t xml:space="preserve">absent — matching the existing SKIP convention for optional-dependency features.</w:t>
       </w:r>
     </w:p>
-    <w:bookmarkEnd w:id="36"/>
-    <w:bookmarkStart w:id="37" w:name="X7441e4fb9d1d1f16b207087dd74b5bc870440c2"/>
+    <w:bookmarkEnd w:id="39"/>
+    <w:bookmarkStart w:id="40" w:name="X7441e4fb9d1d1f16b207087dd74b5bc870440c2"/>
     <w:p>
       <w:pPr>
         <w:pStyle w:val="Heading3"/>
@@ -6330,7 +6663,7 @@
         <w:pStyle w:val="Compact"/>
         <w:numPr>
           <w:ilvl w:val="0"/>
-          <w:numId w:val="1023"/>
+          <w:numId w:val="1025"/>
         </w:numPr>
       </w:pPr>
       <w:r>
@@ -6425,7 +6758,7 @@
         <w:pStyle w:val="Compact"/>
         <w:numPr>
           <w:ilvl w:val="0"/>
-          <w:numId w:val="1023"/>
+          <w:numId w:val="1025"/>
         </w:numPr>
       </w:pPr>
       <w:r>
@@ -6452,7 +6785,7 @@
         <w:pStyle w:val="Compact"/>
         <w:numPr>
           <w:ilvl w:val="0"/>
-          <w:numId w:val="1023"/>
+          <w:numId w:val="1025"/>
         </w:numPr>
       </w:pPr>
       <w:r>
@@ -6491,8 +6824,8 @@
         <w:t xml:space="preserve">.</w:t>
       </w:r>
     </w:p>
-    <w:bookmarkEnd w:id="37"/>
-    <w:bookmarkStart w:id="38" w:name="verified-5"/>
+    <w:bookmarkEnd w:id="40"/>
+    <w:bookmarkStart w:id="41" w:name="verified-6"/>
     <w:p>
       <w:pPr>
         <w:pStyle w:val="Heading3"/>
@@ -6506,7 +6839,7 @@
         <w:pStyle w:val="Compact"/>
         <w:numPr>
           <w:ilvl w:val="0"/>
-          <w:numId w:val="1024"/>
+          <w:numId w:val="1026"/>
         </w:numPr>
       </w:pPr>
       <w:r>
@@ -6546,7 +6879,7 @@
         <w:pStyle w:val="Compact"/>
         <w:numPr>
           <w:ilvl w:val="0"/>
-          <w:numId w:val="1024"/>
+          <w:numId w:val="1026"/>
         </w:numPr>
       </w:pPr>
       <w:r>
@@ -6613,9 +6946,9 @@
         <w:t xml:space="preserve">aliases present on every host.</w:t>
       </w:r>
     </w:p>
-    <w:bookmarkEnd w:id="38"/>
-    <w:bookmarkEnd w:id="39"/>
-    <w:bookmarkStart w:id="44" w:name="Xec4e4bab97bb1465106f99e5371bdd3ec633fc9"/>
+    <w:bookmarkEnd w:id="41"/>
+    <w:bookmarkEnd w:id="42"/>
+    <w:bookmarkStart w:id="47" w:name="Xec4e4bab97bb1465106f99e5371bdd3ec633fc9"/>
     <w:p>
       <w:pPr>
         <w:pStyle w:val="Heading2"/>
@@ -6624,7 +6957,7 @@
         <w:t xml:space="preserve">v1.7.5 — 2026-06-28 — Cross-provider /resume session visibility fix</w:t>
       </w:r>
     </w:p>
-    <w:bookmarkStart w:id="40" w:name="fixed-6"/>
+    <w:bookmarkStart w:id="43" w:name="fixed-6"/>
     <w:p>
       <w:pPr>
         <w:pStyle w:val="Heading3"/>
@@ -6638,7 +6971,7 @@
         <w:pStyle w:val="Compact"/>
         <w:numPr>
           <w:ilvl w:val="0"/>
-          <w:numId w:val="1025"/>
+          <w:numId w:val="1027"/>
         </w:numPr>
       </w:pPr>
       <w:r>
@@ -6813,7 +7146,7 @@
         <w:pStyle w:val="Compact"/>
         <w:numPr>
           <w:ilvl w:val="0"/>
-          <w:numId w:val="1025"/>
+          <w:numId w:val="1027"/>
         </w:numPr>
       </w:pPr>
       <w:r>
@@ -6892,7 +7225,7 @@
         <w:pStyle w:val="Compact"/>
         <w:numPr>
           <w:ilvl w:val="0"/>
-          <w:numId w:val="1025"/>
+          <w:numId w:val="1027"/>
         </w:numPr>
       </w:pPr>
       <w:r>
@@ -6951,8 +7284,8 @@
         <w:t xml:space="preserve">stripping works for all router-transport providers.</w:t>
       </w:r>
     </w:p>
-    <w:bookmarkEnd w:id="40"/>
-    <w:bookmarkStart w:id="41" w:name="root-cause-analysis"/>
+    <w:bookmarkEnd w:id="43"/>
+    <w:bookmarkStart w:id="44" w:name="root-cause-analysis"/>
     <w:p>
       <w:pPr>
         <w:pStyle w:val="Heading3"/>
@@ -7022,7 +7355,7 @@
         <w:pStyle w:val="Compact"/>
         <w:numPr>
           <w:ilvl w:val="0"/>
-          <w:numId w:val="1026"/>
+          <w:numId w:val="1028"/>
         </w:numPr>
       </w:pPr>
       <w:r>
@@ -7058,7 +7391,7 @@
         <w:pStyle w:val="Compact"/>
         <w:numPr>
           <w:ilvl w:val="0"/>
-          <w:numId w:val="1026"/>
+          <w:numId w:val="1028"/>
         </w:numPr>
       </w:pPr>
       <w:r>
@@ -7094,7 +7427,7 @@
         <w:pStyle w:val="Compact"/>
         <w:numPr>
           <w:ilvl w:val="0"/>
-          <w:numId w:val="1026"/>
+          <w:numId w:val="1028"/>
         </w:numPr>
       </w:pPr>
       <w:r>
@@ -7148,8 +7481,8 @@
         <w:t xml:space="preserve">via sync-state.</w:t>
       </w:r>
     </w:p>
-    <w:bookmarkEnd w:id="41"/>
-    <w:bookmarkStart w:id="42" w:name="verified-6"/>
+    <w:bookmarkEnd w:id="44"/>
+    <w:bookmarkStart w:id="45" w:name="verified-7"/>
     <w:p>
       <w:pPr>
         <w:pStyle w:val="Heading3"/>
@@ -7163,7 +7496,7 @@
         <w:pStyle w:val="Compact"/>
         <w:numPr>
           <w:ilvl w:val="0"/>
-          <w:numId w:val="1027"/>
+          <w:numId w:val="1029"/>
         </w:numPr>
       </w:pPr>
       <w:r>
@@ -7197,7 +7530,7 @@
         <w:pStyle w:val="Compact"/>
         <w:numPr>
           <w:ilvl w:val="0"/>
-          <w:numId w:val="1027"/>
+          <w:numId w:val="1029"/>
         </w:numPr>
       </w:pPr>
       <w:r>
@@ -7216,7 +7549,7 @@
         <w:pStyle w:val="Compact"/>
         <w:numPr>
           <w:ilvl w:val="0"/>
-          <w:numId w:val="1027"/>
+          <w:numId w:val="1029"/>
         </w:numPr>
       </w:pPr>
       <w:r>
@@ -7245,8 +7578,8 @@
         <w:t xml:space="preserve">correctly detects and fixes outdated alias files on both hosts</w:t>
       </w:r>
     </w:p>
-    <w:bookmarkEnd w:id="42"/>
-    <w:bookmarkStart w:id="43" w:name="tests"/>
+    <w:bookmarkEnd w:id="45"/>
+    <w:bookmarkStart w:id="46" w:name="tests"/>
     <w:p>
       <w:pPr>
         <w:pStyle w:val="Heading3"/>
@@ -7260,7 +7593,7 @@
         <w:pStyle w:val="Compact"/>
         <w:numPr>
           <w:ilvl w:val="0"/>
-          <w:numId w:val="1028"/>
+          <w:numId w:val="1030"/>
         </w:numPr>
       </w:pPr>
       <w:r>
@@ -7282,16 +7615,16 @@
         <w:pStyle w:val="Compact"/>
         <w:numPr>
           <w:ilvl w:val="0"/>
-          <w:numId w:val="1028"/>
+          <w:numId w:val="1030"/>
         </w:numPr>
       </w:pPr>
       <w:r>
         <w:t xml:space="preserve">Existing test suite: session-related tests pass</w:t>
       </w:r>
     </w:p>
-    <w:bookmarkEnd w:id="43"/>
-    <w:bookmarkEnd w:id="44"/>
-    <w:bookmarkStart w:id="48" w:name="Xec1c151fba8b0f6e04d02f3212d1c75e29f17fb"/>
+    <w:bookmarkEnd w:id="46"/>
+    <w:bookmarkEnd w:id="47"/>
+    <w:bookmarkStart w:id="51" w:name="Xec1c151fba8b0f6e04d02f3212d1c75e29f17fb"/>
     <w:p>
       <w:pPr>
         <w:pStyle w:val="Heading2"/>
@@ -7300,7 +7633,7 @@
         <w:t xml:space="preserve">v1.7.4 — 2026-06-26 — Kimi provider fix + AWS IaC MCP disabled by default</w:t>
       </w:r>
     </w:p>
-    <w:bookmarkStart w:id="45" w:name="fixed-7"/>
+    <w:bookmarkStart w:id="48" w:name="fixed-7"/>
     <w:p>
       <w:pPr>
         <w:pStyle w:val="Heading3"/>
@@ -7314,7 +7647,7 @@
         <w:pStyle w:val="Compact"/>
         <w:numPr>
           <w:ilvl w:val="0"/>
-          <w:numId w:val="1029"/>
+          <w:numId w:val="1031"/>
         </w:numPr>
       </w:pPr>
       <w:r>
@@ -7381,7 +7714,7 @@
         <w:pStyle w:val="Compact"/>
         <w:numPr>
           <w:ilvl w:val="0"/>
-          <w:numId w:val="1029"/>
+          <w:numId w:val="1031"/>
         </w:numPr>
       </w:pPr>
       <w:r>
@@ -7437,8 +7770,8 @@
         <w:t xml:space="preserve">on connection and is now configured but disabled by default.</w:t>
       </w:r>
     </w:p>
-    <w:bookmarkEnd w:id="45"/>
-    <w:bookmarkStart w:id="46" w:name="changed"/>
+    <w:bookmarkEnd w:id="48"/>
+    <w:bookmarkStart w:id="49" w:name="changed"/>
     <w:p>
       <w:pPr>
         <w:pStyle w:val="Heading3"/>
@@ -7452,7 +7785,7 @@
         <w:pStyle w:val="Compact"/>
         <w:numPr>
           <w:ilvl w:val="0"/>
-          <w:numId w:val="1030"/>
+          <w:numId w:val="1032"/>
         </w:numPr>
       </w:pPr>
       <w:r>
@@ -7479,7 +7812,7 @@
         <w:pStyle w:val="Compact"/>
         <w:numPr>
           <w:ilvl w:val="0"/>
-          <w:numId w:val="1030"/>
+          <w:numId w:val="1032"/>
         </w:numPr>
       </w:pPr>
       <w:r>
@@ -7498,8 +7831,8 @@
         <w:t xml:space="preserve">.</w:t>
       </w:r>
     </w:p>
-    <w:bookmarkEnd w:id="46"/>
-    <w:bookmarkStart w:id="47" w:name="tests-1"/>
+    <w:bookmarkEnd w:id="49"/>
+    <w:bookmarkStart w:id="50" w:name="tests-1"/>
     <w:p>
       <w:pPr>
         <w:pStyle w:val="Heading3"/>
@@ -7513,7 +7846,7 @@
         <w:pStyle w:val="Compact"/>
         <w:numPr>
           <w:ilvl w:val="0"/>
-          <w:numId w:val="1031"/>
+          <w:numId w:val="1033"/>
         </w:numPr>
       </w:pPr>
       <w:r>
@@ -7535,7 +7868,7 @@
         <w:pStyle w:val="Compact"/>
         <w:numPr>
           <w:ilvl w:val="0"/>
-          <w:numId w:val="1031"/>
+          <w:numId w:val="1033"/>
         </w:numPr>
       </w:pPr>
       <w:r>
@@ -7560,7 +7893,7 @@
         <w:pStyle w:val="Compact"/>
         <w:numPr>
           <w:ilvl w:val="0"/>
-          <w:numId w:val="1031"/>
+          <w:numId w:val="1033"/>
         </w:numPr>
       </w:pPr>
       <w:r>
@@ -7577,9 +7910,9 @@
         <w:t xml:space="preserve">5 passed, 0 failed</w:t>
       </w:r>
     </w:p>
-    <w:bookmarkEnd w:id="47"/>
-    <w:bookmarkEnd w:id="48"/>
-    <w:bookmarkStart w:id="53" w:name="X9bd238ab6e70094b91f95682e0c680fd3b532e6"/>
+    <w:bookmarkEnd w:id="50"/>
+    <w:bookmarkEnd w:id="51"/>
+    <w:bookmarkStart w:id="56" w:name="X9bd238ab6e70094b91f95682e0c680fd3b532e6"/>
     <w:p>
       <w:pPr>
         <w:pStyle w:val="Heading2"/>
@@ -7588,7 +7921,7 @@
         <w:t xml:space="preserve">v1.6.6 — 2026-06-21 — TOON integration for token-efficient prompts</w:t>
       </w:r>
     </w:p>
-    <w:bookmarkStart w:id="49" w:name="added-3"/>
+    <w:bookmarkStart w:id="52" w:name="added-4"/>
     <w:p>
       <w:pPr>
         <w:pStyle w:val="Heading3"/>
@@ -7602,7 +7935,7 @@
         <w:pStyle w:val="Compact"/>
         <w:numPr>
           <w:ilvl w:val="0"/>
-          <w:numId w:val="1032"/>
+          <w:numId w:val="1034"/>
         </w:numPr>
       </w:pPr>
       <w:r>
@@ -7630,7 +7963,7 @@
         <w:pStyle w:val="Compact"/>
         <w:numPr>
           <w:ilvl w:val="0"/>
-          <w:numId w:val="1032"/>
+          <w:numId w:val="1034"/>
         </w:numPr>
       </w:pPr>
       <w:r>
@@ -7653,7 +7986,7 @@
         <w:pStyle w:val="Compact"/>
         <w:numPr>
           <w:ilvl w:val="0"/>
-          <w:numId w:val="1032"/>
+          <w:numId w:val="1034"/>
         </w:numPr>
       </w:pPr>
       <w:r>
@@ -7676,7 +8009,7 @@
         <w:pStyle w:val="Compact"/>
         <w:numPr>
           <w:ilvl w:val="0"/>
-          <w:numId w:val="1032"/>
+          <w:numId w:val="1034"/>
         </w:numPr>
       </w:pPr>
       <w:r>
@@ -7699,7 +8032,7 @@
         <w:pStyle w:val="Compact"/>
         <w:numPr>
           <w:ilvl w:val="0"/>
-          <w:numId w:val="1032"/>
+          <w:numId w:val="1034"/>
         </w:numPr>
       </w:pPr>
       <w:r>
@@ -7732,8 +8065,8 @@
         <w:t xml:space="preserve">v2.3.0 dependency</w:t>
       </w:r>
     </w:p>
-    <w:bookmarkEnd w:id="49"/>
-    <w:bookmarkStart w:id="50" w:name="token-savings"/>
+    <w:bookmarkEnd w:id="52"/>
+    <w:bookmarkStart w:id="53" w:name="token-savings"/>
     <w:p>
       <w:pPr>
         <w:pStyle w:val="Heading3"/>
@@ -7747,7 +8080,7 @@
         <w:pStyle w:val="Compact"/>
         <w:numPr>
           <w:ilvl w:val="0"/>
-          <w:numId w:val="1033"/>
+          <w:numId w:val="1035"/>
         </w:numPr>
       </w:pPr>
       <w:r>
@@ -7759,7 +8092,7 @@
         <w:pStyle w:val="Compact"/>
         <w:numPr>
           <w:ilvl w:val="0"/>
-          <w:numId w:val="1033"/>
+          <w:numId w:val="1035"/>
         </w:numPr>
       </w:pPr>
       <w:r>
@@ -7771,7 +8104,7 @@
         <w:pStyle w:val="Compact"/>
         <w:numPr>
           <w:ilvl w:val="0"/>
-          <w:numId w:val="1033"/>
+          <w:numId w:val="1035"/>
         </w:numPr>
       </w:pPr>
       <w:r>
@@ -7783,15 +8116,15 @@
         <w:pStyle w:val="Compact"/>
         <w:numPr>
           <w:ilvl w:val="0"/>
-          <w:numId w:val="1033"/>
+          <w:numId w:val="1035"/>
         </w:numPr>
       </w:pPr>
       <w:r>
         <w:t xml:space="preserve">Accuracy: 76.4% (vs JSON's 75.0%)</w:t>
       </w:r>
     </w:p>
-    <w:bookmarkEnd w:id="50"/>
-    <w:bookmarkStart w:id="51" w:name="note"/>
+    <w:bookmarkEnd w:id="53"/>
+    <w:bookmarkStart w:id="54" w:name="note"/>
     <w:p>
       <w:pPr>
         <w:pStyle w:val="Heading3"/>
@@ -7814,8 +8147,8 @@
         <w:t xml:space="preserve">(providers require it). HTTP/3 and compression require provider-side support.</w:t>
       </w:r>
     </w:p>
-    <w:bookmarkEnd w:id="51"/>
-    <w:bookmarkStart w:id="52" w:name="tests-2"/>
+    <w:bookmarkEnd w:id="54"/>
+    <w:bookmarkStart w:id="55" w:name="tests-2"/>
     <w:p>
       <w:pPr>
         <w:pStyle w:val="Heading3"/>
@@ -7829,16 +8162,16 @@
         <w:pStyle w:val="Compact"/>
         <w:numPr>
           <w:ilvl w:val="0"/>
-          <w:numId w:val="1034"/>
+          <w:numId w:val="1036"/>
         </w:numPr>
       </w:pPr>
       <w:r>
         <w:t xml:space="preserve">8/8 ALL GREEN</w:t>
       </w:r>
     </w:p>
-    <w:bookmarkEnd w:id="52"/>
-    <w:bookmarkEnd w:id="53"/>
-    <w:bookmarkStart w:id="57" w:name="X9237cd4bb03a72b6dc5a03c01976a74cdd15263"/>
+    <w:bookmarkEnd w:id="55"/>
+    <w:bookmarkEnd w:id="56"/>
+    <w:bookmarkStart w:id="60" w:name="X9237cd4bb03a72b6dc5a03c01976a74cdd15263"/>
     <w:p>
       <w:pPr>
         <w:pStyle w:val="Heading2"/>
@@ -7847,7 +8180,7 @@
         <w:t xml:space="preserve">v1.6.5 — 2026-06-21 — Poe proxy fix (alias file + install)</w:t>
       </w:r>
     </w:p>
-    <w:bookmarkStart w:id="54" w:name="fixed-8"/>
+    <w:bookmarkStart w:id="57" w:name="fixed-8"/>
     <w:p>
       <w:pPr>
         <w:pStyle w:val="Heading3"/>
@@ -7861,7 +8194,7 @@
         <w:pStyle w:val="Compact"/>
         <w:numPr>
           <w:ilvl w:val="0"/>
-          <w:numId w:val="1035"/>
+          <w:numId w:val="1037"/>
         </w:numPr>
       </w:pPr>
       <w:r>
@@ -7922,7 +8255,7 @@
         <w:pStyle w:val="Compact"/>
         <w:numPr>
           <w:ilvl w:val="0"/>
-          <w:numId w:val="1035"/>
+          <w:numId w:val="1037"/>
         </w:numPr>
       </w:pPr>
       <w:r>
@@ -7971,7 +8304,7 @@
         <w:pStyle w:val="Compact"/>
         <w:numPr>
           <w:ilvl w:val="0"/>
-          <w:numId w:val="1035"/>
+          <w:numId w:val="1037"/>
         </w:numPr>
       </w:pPr>
       <w:r>
@@ -8003,8 +8336,8 @@
         <w:t xml:space="preserve">during install.</w:t>
       </w:r>
     </w:p>
-    <w:bookmarkEnd w:id="54"/>
-    <w:bookmarkStart w:id="55" w:name="verified-7"/>
+    <w:bookmarkEnd w:id="57"/>
+    <w:bookmarkStart w:id="58" w:name="verified-8"/>
     <w:p>
       <w:pPr>
         <w:pStyle w:val="Heading3"/>
@@ -8018,7 +8351,7 @@
         <w:pStyle w:val="Compact"/>
         <w:numPr>
           <w:ilvl w:val="0"/>
-          <w:numId w:val="1036"/>
+          <w:numId w:val="1038"/>
         </w:numPr>
       </w:pPr>
       <w:r>
@@ -8075,15 +8408,15 @@
         <w:pStyle w:val="Compact"/>
         <w:numPr>
           <w:ilvl w:val="0"/>
-          <w:numId w:val="1036"/>
+          <w:numId w:val="1038"/>
         </w:numPr>
       </w:pPr>
       <w:r>
         <w:t xml:space="preserve">Deployed to both local host and nezha.local</w:t>
       </w:r>
     </w:p>
-    <w:bookmarkEnd w:id="55"/>
-    <w:bookmarkStart w:id="56" w:name="tests-3"/>
+    <w:bookmarkEnd w:id="58"/>
+    <w:bookmarkStart w:id="59" w:name="tests-3"/>
     <w:p>
       <w:pPr>
         <w:pStyle w:val="Heading3"/>
@@ -8097,16 +8430,16 @@
         <w:pStyle w:val="Compact"/>
         <w:numPr>
           <w:ilvl w:val="0"/>
-          <w:numId w:val="1037"/>
+          <w:numId w:val="1039"/>
         </w:numPr>
       </w:pPr>
       <w:r>
         <w:t xml:space="preserve">8/8 ALL GREEN</w:t>
       </w:r>
     </w:p>
-    <w:bookmarkEnd w:id="56"/>
-    <w:bookmarkEnd w:id="57"/>
-    <w:bookmarkStart w:id="61" w:name="X64087af2920030f2c3773a9b8de13830a649fe9"/>
+    <w:bookmarkEnd w:id="59"/>
+    <w:bookmarkEnd w:id="60"/>
+    <w:bookmarkStart w:id="64" w:name="X64087af2920030f2c3773a9b8de13830a649fe9"/>
     <w:p>
       <w:pPr>
         <w:pStyle w:val="Heading2"/>
@@ -8115,7 +8448,7 @@
         <w:t xml:space="preserve">v1.6.4 — 2026-06-21 — Poe proxy fix for tool compatibility</w:t>
       </w:r>
     </w:p>
-    <w:bookmarkStart w:id="58" w:name="fixed-9"/>
+    <w:bookmarkStart w:id="61" w:name="fixed-9"/>
     <w:p>
       <w:pPr>
         <w:pStyle w:val="Heading3"/>
@@ -8129,7 +8462,7 @@
         <w:pStyle w:val="Compact"/>
         <w:numPr>
           <w:ilvl w:val="0"/>
-          <w:numId w:val="1038"/>
+          <w:numId w:val="1040"/>
         </w:numPr>
       </w:pPr>
       <w:r>
@@ -8193,7 +8526,7 @@
         <w:pStyle w:val="Compact"/>
         <w:numPr>
           <w:ilvl w:val="0"/>
-          <w:numId w:val="1038"/>
+          <w:numId w:val="1040"/>
         </w:numPr>
       </w:pPr>
       <w:r>
@@ -8243,8 +8576,8 @@
         <w:t xml:space="preserve">).</w:t>
       </w:r>
     </w:p>
-    <w:bookmarkEnd w:id="58"/>
-    <w:bookmarkStart w:id="59" w:name="verified-8"/>
+    <w:bookmarkEnd w:id="61"/>
+    <w:bookmarkStart w:id="62" w:name="verified-9"/>
     <w:p>
       <w:pPr>
         <w:pStyle w:val="Heading3"/>
@@ -8258,7 +8591,7 @@
         <w:pStyle w:val="Compact"/>
         <w:numPr>
           <w:ilvl w:val="0"/>
-          <w:numId w:val="1039"/>
+          <w:numId w:val="1041"/>
         </w:numPr>
       </w:pPr>
       <w:r>
@@ -8310,8 +8643,8 @@
         <w:t xml:space="preserve">✅</w:t>
       </w:r>
     </w:p>
-    <w:bookmarkEnd w:id="59"/>
-    <w:bookmarkStart w:id="60" w:name="tests-4"/>
+    <w:bookmarkEnd w:id="62"/>
+    <w:bookmarkStart w:id="63" w:name="tests-4"/>
     <w:p>
       <w:pPr>
         <w:pStyle w:val="Heading3"/>
@@ -8325,343 +8658,31 @@
         <w:pStyle w:val="Compact"/>
         <w:numPr>
           <w:ilvl w:val="0"/>
-          <w:numId w:val="1040"/>
+          <w:numId w:val="1042"/>
         </w:numPr>
       </w:pPr>
       <w:r>
         <w:t xml:space="preserve">8/8 ALL GREEN</w:t>
-      </w:r>
-    </w:p>
-    <w:bookmarkEnd w:id="60"/>
-    <w:bookmarkEnd w:id="61"/>
-    <w:bookmarkStart w:id="64" w:name="X5ec18949a21827efef04e4858f2416f947a13fe"/>
-    <w:p>
-      <w:pPr>
-        <w:pStyle w:val="Heading2"/>
-      </w:pPr>
-      <w:r>
-        <w:t xml:space="preserve">v1.6.3 — 2026-06-21 — Poe provider (382 models, 3 aliases)</w:t>
-      </w:r>
-    </w:p>
-    <w:bookmarkStart w:id="62" w:name="added-4"/>
-    <w:p>
-      <w:pPr>
-        <w:pStyle w:val="Heading3"/>
-      </w:pPr>
-      <w:r>
-        <w:t xml:space="preserve">Added</w:t>
-      </w:r>
-    </w:p>
-    <w:p>
-      <w:pPr>
-        <w:pStyle w:val="Compact"/>
-        <w:numPr>
-          <w:ilvl w:val="0"/>
-          <w:numId w:val="1041"/>
-        </w:numPr>
-      </w:pPr>
-      <w:r>
-        <w:rPr>
-          <w:b/>
-          <w:bCs/>
-        </w:rPr>
-        <w:t xml:space="preserve">Poe provider</w:t>
-      </w:r>
-      <w:r>
-        <w:t xml:space="preserve"> </w:t>
-      </w:r>
-      <w:r>
-        <w:t xml:space="preserve">— universal AI platform with 382 models from all major providers.</w:t>
-      </w:r>
-      <w:r>
-        <w:t xml:space="preserve"> </w:t>
-      </w:r>
-      <w:r>
-        <w:t xml:space="preserve">OpenAI-compatible API at</w:t>
-      </w:r>
-      <w:r>
-        <w:t xml:space="preserve"> </w:t>
-      </w:r>
-      <w:r>
-        <w:rPr>
-          <w:rStyle w:val="VerbatimChar"/>
-        </w:rPr>
-        <w:t xml:space="preserve">https://api.poe.com/v1</w:t>
-      </w:r>
-      <w:r>
-        <w:t xml:space="preserve">. Chat, code, image gen, video gen,</w:t>
-      </w:r>
-      <w:r>
-        <w:t xml:space="preserve"> </w:t>
-      </w:r>
-      <w:r>
-        <w:t xml:space="preserve">TTS, STT, and more.</w:t>
-      </w:r>
-    </w:p>
-    <w:p>
-      <w:pPr>
-        <w:pStyle w:val="Compact"/>
-        <w:numPr>
-          <w:ilvl w:val="0"/>
-          <w:numId w:val="1041"/>
-        </w:numPr>
-      </w:pPr>
-      <w:r>
-        <w:rPr>
-          <w:b/>
-          <w:bCs/>
-        </w:rPr>
-        <w:t xml:space="preserve">3 aliases</w:t>
-      </w:r>
-      <w:r>
-        <w:t xml:space="preserve">:</w:t>
-      </w:r>
-      <w:r>
-        <w:t xml:space="preserve"> </w:t>
-      </w:r>
-      <w:r>
-        <w:rPr>
-          <w:rStyle w:val="VerbatimChar"/>
-        </w:rPr>
-        <w:t xml:space="preserve">poe</w:t>
-      </w:r>
-      <w:r>
-        <w:t xml:space="preserve"> </w:t>
-      </w:r>
-      <w:r>
-        <w:t xml:space="preserve">(claude-sonnet-4.6 + gpt-5.4-mini),</w:t>
-      </w:r>
-      <w:r>
-        <w:t xml:space="preserve"> </w:t>
-      </w:r>
-      <w:r>
-        <w:rPr>
-          <w:rStyle w:val="VerbatimChar"/>
-        </w:rPr>
-        <w:t xml:space="preserve">poe2</w:t>
-      </w:r>
-      <w:r>
-        <w:t xml:space="preserve"> </w:t>
-      </w:r>
-      <w:r>
-        <w:t xml:space="preserve">(gpt-5.5 + deepseek-v4-pro-e),</w:t>
-      </w:r>
-      <w:r>
-        <w:t xml:space="preserve"> </w:t>
-      </w:r>
-      <w:r>
-        <w:rPr>
-          <w:rStyle w:val="VerbatimChar"/>
-        </w:rPr>
-        <w:t xml:space="preserve">poe3</w:t>
-      </w:r>
-      <w:r>
-        <w:t xml:space="preserve"> </w:t>
-      </w:r>
-      <w:r>
-        <w:t xml:space="preserve">(grok-4 + gemini-3.1-pro)</w:t>
-      </w:r>
-    </w:p>
-    <w:p>
-      <w:pPr>
-        <w:pStyle w:val="Compact"/>
-        <w:numPr>
-          <w:ilvl w:val="0"/>
-          <w:numId w:val="1041"/>
-        </w:numPr>
-      </w:pPr>
-      <w:r>
-        <w:rPr>
-          <w:b/>
-          <w:bCs/>
-        </w:rPr>
-        <w:t xml:space="preserve">key-aliases</w:t>
-      </w:r>
-      <w:r>
-        <w:t xml:space="preserve">:</w:t>
-      </w:r>
-      <w:r>
-        <w:t xml:space="preserve"> </w:t>
-      </w:r>
-      <w:r>
-        <w:rPr>
-          <w:rStyle w:val="VerbatimChar"/>
-        </w:rPr>
-        <w:t xml:space="preserve">POE_API_KEY</w:t>
-      </w:r>
-      <w:r>
-        <w:t xml:space="preserve"> </w:t>
-      </w:r>
-      <w:r>
-        <w:t xml:space="preserve">+</w:t>
-      </w:r>
-      <w:r>
-        <w:t xml:space="preserve"> </w:t>
-      </w:r>
-      <w:r>
-        <w:rPr>
-          <w:rStyle w:val="VerbatimChar"/>
-        </w:rPr>
-        <w:t xml:space="preserve">ApiKey_Poe</w:t>
-      </w:r>
-      <w:r>
-        <w:t xml:space="preserve"> </w:t>
-      </w:r>
-      <w:r>
-        <w:t xml:space="preserve">→</w:t>
-      </w:r>
-      <w:r>
-        <w:t xml:space="preserve"> </w:t>
-      </w:r>
-      <w:r>
-        <w:rPr>
-          <w:rStyle w:val="VerbatimChar"/>
-        </w:rPr>
-        <w:t xml:space="preserve">poe</w:t>
-      </w:r>
-    </w:p>
-    <w:p>
-      <w:pPr>
-        <w:pStyle w:val="Compact"/>
-        <w:numPr>
-          <w:ilvl w:val="0"/>
-          <w:numId w:val="1041"/>
-        </w:numPr>
-      </w:pPr>
-      <w:r>
-        <w:rPr>
-          <w:b/>
-          <w:bCs/>
-        </w:rPr>
-        <w:t xml:space="preserve">Tool calling verified</w:t>
-      </w:r>
-      <w:r>
-        <w:t xml:space="preserve"> </w:t>
-      </w:r>
-      <w:r>
-        <w:t xml:space="preserve">on claude-sonnet-4.6, gpt-5.4-mini, deepseek-v4-pro-e, grok-4</w:t>
-      </w:r>
-    </w:p>
-    <w:p>
-      <w:pPr>
-        <w:pStyle w:val="Compact"/>
-        <w:numPr>
-          <w:ilvl w:val="0"/>
-          <w:numId w:val="1041"/>
-        </w:numPr>
-      </w:pPr>
-      <w:r>
-        <w:rPr>
-          <w:b/>
-          <w:bCs/>
-        </w:rPr>
-        <w:t xml:space="preserve">382 models categorized</w:t>
-      </w:r>
-      <w:r>
-        <w:t xml:space="preserve">: 130 chat/reasoning, 16 code, 40 image gen, 17 video gen,</w:t>
-      </w:r>
-      <w:r>
-        <w:t xml:space="preserve"> </w:t>
-      </w:r>
-      <w:r>
-        <w:t xml:space="preserve">12 TTS, 1 STT, 166 other</w:t>
-      </w:r>
-    </w:p>
-    <w:p>
-      <w:pPr>
-        <w:pStyle w:val="Compact"/>
-        <w:numPr>
-          <w:ilvl w:val="0"/>
-          <w:numId w:val="1041"/>
-        </w:numPr>
-      </w:pPr>
-      <w:r>
-        <w:rPr>
-          <w:b/>
-          <w:bCs/>
-        </w:rPr>
-        <w:t xml:space="preserve">Documentation</w:t>
-      </w:r>
-      <w:r>
-        <w:t xml:space="preserve">: full Poe section in Provider_Aliases_User_Guide.md</w:t>
-      </w:r>
-    </w:p>
-    <w:bookmarkEnd w:id="62"/>
-    <w:bookmarkStart w:id="63" w:name="verified-9"/>
-    <w:p>
-      <w:pPr>
-        <w:pStyle w:val="Heading3"/>
-      </w:pPr>
-      <w:r>
-        <w:t xml:space="preserve">Verified</w:t>
-      </w:r>
-    </w:p>
-    <w:p>
-      <w:pPr>
-        <w:pStyle w:val="Compact"/>
-        <w:numPr>
-          <w:ilvl w:val="0"/>
-          <w:numId w:val="1042"/>
-        </w:numPr>
-      </w:pPr>
-      <w:r>
-        <w:t xml:space="preserve">API endpoint responds correctly</w:t>
-      </w:r>
-    </w:p>
-    <w:p>
-      <w:pPr>
-        <w:pStyle w:val="Compact"/>
-        <w:numPr>
-          <w:ilvl w:val="0"/>
-          <w:numId w:val="1042"/>
-        </w:numPr>
-      </w:pPr>
-      <w:r>
-        <w:t xml:space="preserve">Authentication works</w:t>
-      </w:r>
-    </w:p>
-    <w:p>
-      <w:pPr>
-        <w:pStyle w:val="Compact"/>
-        <w:numPr>
-          <w:ilvl w:val="0"/>
-          <w:numId w:val="1042"/>
-        </w:numPr>
-      </w:pPr>
-      <w:r>
-        <w:t xml:space="preserve">Tool calling confirmed</w:t>
-      </w:r>
-    </w:p>
-    <w:p>
-      <w:pPr>
-        <w:pStyle w:val="Compact"/>
-        <w:numPr>
-          <w:ilvl w:val="0"/>
-          <w:numId w:val="1042"/>
-        </w:numPr>
-      </w:pPr>
-      <w:r>
-        <w:t xml:space="preserve">All 3 aliases tested through ccr with "Do you see our codebase?" — all YES</w:t>
       </w:r>
     </w:p>
     <w:bookmarkEnd w:id="63"/>
     <w:bookmarkEnd w:id="64"/>
-    <w:bookmarkStart w:id="67" w:name="Xdf48572774f97e3e2c130948cecb4cf2a500aa1"/>
+    <w:bookmarkStart w:id="67" w:name="X5ec18949a21827efef04e4858f2416f947a13fe"/>
     <w:p>
       <w:pPr>
         <w:pStyle w:val="Heading2"/>
       </w:pPr>
       <w:r>
-        <w:t xml:space="preserve">v1.6.2 — 2026-06-21 — Chutes provider documentation + model update</w:t>
-      </w:r>
-    </w:p>
-    <w:bookmarkStart w:id="65" w:name="changed-1"/>
+        <w:t xml:space="preserve">v1.6.3 — 2026-06-21 — Poe provider (382 models, 3 aliases)</w:t>
+      </w:r>
+    </w:p>
+    <w:bookmarkStart w:id="65" w:name="added-5"/>
     <w:p>
       <w:pPr>
         <w:pStyle w:val="Heading3"/>
       </w:pPr>
       <w:r>
-        <w:t xml:space="preserve">Changed</w:t>
+        <w:t xml:space="preserve">Added</w:t>
       </w:r>
     </w:p>
     <w:p>
@@ -8677,43 +8698,37 @@
           <w:b/>
           <w:bCs/>
         </w:rPr>
-        <w:t xml:space="preserve">Chutes provider models updated</w:t>
-      </w:r>
-      <w:r>
-        <w:t xml:space="preserve"> </w:t>
-      </w:r>
-      <w:r>
-        <w:t xml:space="preserve">— catalog was stale. Chutes now offers 13 TEE</w:t>
-      </w:r>
-      <w:r>
-        <w:t xml:space="preserve"> </w:t>
-      </w:r>
-      <w:r>
-        <w:t xml:space="preserve">(Trusted Execution Environment) models. Updated strong=</w:t>
-      </w:r>
-      <w:r>
-        <w:rPr>
-          <w:rStyle w:val="VerbatimChar"/>
-        </w:rPr>
-        <w:t xml:space="preserve">zai-org/GLM-5.2-TEE</w:t>
-      </w:r>
-      <w:r>
-        <w:t xml:space="preserve">,</w:t>
-      </w:r>
-      <w:r>
-        <w:t xml:space="preserve"> </w:t>
-      </w:r>
-      <w:r>
-        <w:t xml:space="preserve">fast=</w:t>
-      </w:r>
-      <w:r>
-        <w:rPr>
-          <w:rStyle w:val="VerbatimChar"/>
-        </w:rPr>
-        <w:t xml:space="preserve">Qwen/Qwen3.6-27B-TEE</w:t>
-      </w:r>
-      <w:r>
-        <w:t xml:space="preserve">.</w:t>
+        <w:t xml:space="preserve">Poe provider</w:t>
+      </w:r>
+      <w:r>
+        <w:t xml:space="preserve"> </w:t>
+      </w:r>
+      <w:r>
+        <w:t xml:space="preserve">— universal AI platform with 382 models from all major providers.</w:t>
+      </w:r>
+      <w:r>
+        <w:t xml:space="preserve"> </w:t>
+      </w:r>
+      <w:r>
+        <w:t xml:space="preserve">OpenAI-compatible API at</w:t>
+      </w:r>
+      <w:r>
+        <w:t xml:space="preserve"> </w:t>
+      </w:r>
+      <w:r>
+        <w:rPr>
+          <w:rStyle w:val="VerbatimChar"/>
+        </w:rPr>
+        <w:t xml:space="preserve">https://api.poe.com/v1</w:t>
+      </w:r>
+      <w:r>
+        <w:t xml:space="preserve">. Chat, code, image gen, video gen,</w:t>
+      </w:r>
+      <w:r>
+        <w:t xml:space="preserve"> </w:t>
+      </w:r>
+      <w:r>
+        <w:t xml:space="preserve">TTS, STT, and more.</w:t>
       </w:r>
     </w:p>
     <w:p>
@@ -8729,19 +8744,179 @@
           <w:b/>
           <w:bCs/>
         </w:rPr>
-        <w:t xml:space="preserve">Chutes documentation</w:t>
-      </w:r>
-      <w:r>
-        <w:t xml:space="preserve"> </w:t>
-      </w:r>
-      <w:r>
-        <w:t xml:space="preserve">added to Provider_Aliases_User_Guide.md with full model</w:t>
-      </w:r>
-      <w:r>
-        <w:t xml:space="preserve"> </w:t>
-      </w:r>
-      <w:r>
-        <w:t xml:space="preserve">table, TEE explanation, pay-per-use note, and setup instructions.</w:t>
+        <w:t xml:space="preserve">3 aliases</w:t>
+      </w:r>
+      <w:r>
+        <w:t xml:space="preserve">:</w:t>
+      </w:r>
+      <w:r>
+        <w:t xml:space="preserve"> </w:t>
+      </w:r>
+      <w:r>
+        <w:rPr>
+          <w:rStyle w:val="VerbatimChar"/>
+        </w:rPr>
+        <w:t xml:space="preserve">poe</w:t>
+      </w:r>
+      <w:r>
+        <w:t xml:space="preserve"> </w:t>
+      </w:r>
+      <w:r>
+        <w:t xml:space="preserve">(claude-sonnet-4.6 + gpt-5.4-mini),</w:t>
+      </w:r>
+      <w:r>
+        <w:t xml:space="preserve"> </w:t>
+      </w:r>
+      <w:r>
+        <w:rPr>
+          <w:rStyle w:val="VerbatimChar"/>
+        </w:rPr>
+        <w:t xml:space="preserve">poe2</w:t>
+      </w:r>
+      <w:r>
+        <w:t xml:space="preserve"> </w:t>
+      </w:r>
+      <w:r>
+        <w:t xml:space="preserve">(gpt-5.5 + deepseek-v4-pro-e),</w:t>
+      </w:r>
+      <w:r>
+        <w:t xml:space="preserve"> </w:t>
+      </w:r>
+      <w:r>
+        <w:rPr>
+          <w:rStyle w:val="VerbatimChar"/>
+        </w:rPr>
+        <w:t xml:space="preserve">poe3</w:t>
+      </w:r>
+      <w:r>
+        <w:t xml:space="preserve"> </w:t>
+      </w:r>
+      <w:r>
+        <w:t xml:space="preserve">(grok-4 + gemini-3.1-pro)</w:t>
+      </w:r>
+    </w:p>
+    <w:p>
+      <w:pPr>
+        <w:pStyle w:val="Compact"/>
+        <w:numPr>
+          <w:ilvl w:val="0"/>
+          <w:numId w:val="1043"/>
+        </w:numPr>
+      </w:pPr>
+      <w:r>
+        <w:rPr>
+          <w:b/>
+          <w:bCs/>
+        </w:rPr>
+        <w:t xml:space="preserve">key-aliases</w:t>
+      </w:r>
+      <w:r>
+        <w:t xml:space="preserve">:</w:t>
+      </w:r>
+      <w:r>
+        <w:t xml:space="preserve"> </w:t>
+      </w:r>
+      <w:r>
+        <w:rPr>
+          <w:rStyle w:val="VerbatimChar"/>
+        </w:rPr>
+        <w:t xml:space="preserve">POE_API_KEY</w:t>
+      </w:r>
+      <w:r>
+        <w:t xml:space="preserve"> </w:t>
+      </w:r>
+      <w:r>
+        <w:t xml:space="preserve">+</w:t>
+      </w:r>
+      <w:r>
+        <w:t xml:space="preserve"> </w:t>
+      </w:r>
+      <w:r>
+        <w:rPr>
+          <w:rStyle w:val="VerbatimChar"/>
+        </w:rPr>
+        <w:t xml:space="preserve">ApiKey_Poe</w:t>
+      </w:r>
+      <w:r>
+        <w:t xml:space="preserve"> </w:t>
+      </w:r>
+      <w:r>
+        <w:t xml:space="preserve">→</w:t>
+      </w:r>
+      <w:r>
+        <w:t xml:space="preserve"> </w:t>
+      </w:r>
+      <w:r>
+        <w:rPr>
+          <w:rStyle w:val="VerbatimChar"/>
+        </w:rPr>
+        <w:t xml:space="preserve">poe</w:t>
+      </w:r>
+    </w:p>
+    <w:p>
+      <w:pPr>
+        <w:pStyle w:val="Compact"/>
+        <w:numPr>
+          <w:ilvl w:val="0"/>
+          <w:numId w:val="1043"/>
+        </w:numPr>
+      </w:pPr>
+      <w:r>
+        <w:rPr>
+          <w:b/>
+          <w:bCs/>
+        </w:rPr>
+        <w:t xml:space="preserve">Tool calling verified</w:t>
+      </w:r>
+      <w:r>
+        <w:t xml:space="preserve"> </w:t>
+      </w:r>
+      <w:r>
+        <w:t xml:space="preserve">on claude-sonnet-4.6, gpt-5.4-mini, deepseek-v4-pro-e, grok-4</w:t>
+      </w:r>
+    </w:p>
+    <w:p>
+      <w:pPr>
+        <w:pStyle w:val="Compact"/>
+        <w:numPr>
+          <w:ilvl w:val="0"/>
+          <w:numId w:val="1043"/>
+        </w:numPr>
+      </w:pPr>
+      <w:r>
+        <w:rPr>
+          <w:b/>
+          <w:bCs/>
+        </w:rPr>
+        <w:t xml:space="preserve">382 models categorized</w:t>
+      </w:r>
+      <w:r>
+        <w:t xml:space="preserve">: 130 chat/reasoning, 16 code, 40 image gen, 17 video gen,</w:t>
+      </w:r>
+      <w:r>
+        <w:t xml:space="preserve"> </w:t>
+      </w:r>
+      <w:r>
+        <w:t xml:space="preserve">12 TTS, 1 STT, 166 other</w:t>
+      </w:r>
+    </w:p>
+    <w:p>
+      <w:pPr>
+        <w:pStyle w:val="Compact"/>
+        <w:numPr>
+          <w:ilvl w:val="0"/>
+          <w:numId w:val="1043"/>
+        </w:numPr>
+      </w:pPr>
+      <w:r>
+        <w:rPr>
+          <w:b/>
+          <w:bCs/>
+        </w:rPr>
+        <w:t xml:space="preserve">Documentation</w:t>
+      </w:r>
+      <w:r>
+        <w:t xml:space="preserve">: full Poe section in Provider_Aliases_User_Guide.md</w:t>
       </w:r>
     </w:p>
     <w:bookmarkEnd w:id="65"/>
@@ -8763,7 +8938,7 @@
         </w:numPr>
       </w:pPr>
       <w:r>
-        <w:t xml:space="preserve">Chutes API endpoint responds correctly</w:t>
+        <w:t xml:space="preserve">API endpoint responds correctly</w:t>
       </w:r>
     </w:p>
     <w:p>
@@ -8775,7 +8950,7 @@
         </w:numPr>
       </w:pPr>
       <w:r>
-        <w:t xml:space="preserve">All 13 TEE models accessible (require funded account for actual inference)</w:t>
+        <w:t xml:space="preserve">Authentication works</w:t>
       </w:r>
     </w:p>
     <w:p>
@@ -8787,30 +8962,188 @@
         </w:numPr>
       </w:pPr>
       <w:r>
-        <w:t xml:space="preserve">OpenAI-compatible format confirmed at</w:t>
-      </w:r>
-      <w:r>
-        <w:t xml:space="preserve"> </w:t>
-      </w:r>
-      <w:r>
-        <w:rPr>
-          <w:rStyle w:val="VerbatimChar"/>
-        </w:rPr>
-        <w:t xml:space="preserve">https://llm.chutes.ai/v1</w:t>
+        <w:t xml:space="preserve">Tool calling confirmed</w:t>
+      </w:r>
+    </w:p>
+    <w:p>
+      <w:pPr>
+        <w:pStyle w:val="Compact"/>
+        <w:numPr>
+          <w:ilvl w:val="0"/>
+          <w:numId w:val="1044"/>
+        </w:numPr>
+      </w:pPr>
+      <w:r>
+        <w:t xml:space="preserve">All 3 aliases tested through ccr with "Do you see our codebase?" — all YES</w:t>
       </w:r>
     </w:p>
     <w:bookmarkEnd w:id="66"/>
     <w:bookmarkEnd w:id="67"/>
-    <w:bookmarkStart w:id="71" w:name="X27edce9e35c5d24fd18298996022e3d241784db"/>
+    <w:bookmarkStart w:id="70" w:name="Xdf48572774f97e3e2c130948cecb4cf2a500aa1"/>
     <w:p>
       <w:pPr>
         <w:pStyle w:val="Heading2"/>
       </w:pPr>
       <w:r>
+        <w:t xml:space="preserve">v1.6.2 — 2026-06-21 — Chutes provider documentation + model update</w:t>
+      </w:r>
+    </w:p>
+    <w:bookmarkStart w:id="68" w:name="changed-1"/>
+    <w:p>
+      <w:pPr>
+        <w:pStyle w:val="Heading3"/>
+      </w:pPr>
+      <w:r>
+        <w:t xml:space="preserve">Changed</w:t>
+      </w:r>
+    </w:p>
+    <w:p>
+      <w:pPr>
+        <w:pStyle w:val="Compact"/>
+        <w:numPr>
+          <w:ilvl w:val="0"/>
+          <w:numId w:val="1045"/>
+        </w:numPr>
+      </w:pPr>
+      <w:r>
+        <w:rPr>
+          <w:b/>
+          <w:bCs/>
+        </w:rPr>
+        <w:t xml:space="preserve">Chutes provider models updated</w:t>
+      </w:r>
+      <w:r>
+        <w:t xml:space="preserve"> </w:t>
+      </w:r>
+      <w:r>
+        <w:t xml:space="preserve">— catalog was stale. Chutes now offers 13 TEE</w:t>
+      </w:r>
+      <w:r>
+        <w:t xml:space="preserve"> </w:t>
+      </w:r>
+      <w:r>
+        <w:t xml:space="preserve">(Trusted Execution Environment) models. Updated strong=</w:t>
+      </w:r>
+      <w:r>
+        <w:rPr>
+          <w:rStyle w:val="VerbatimChar"/>
+        </w:rPr>
+        <w:t xml:space="preserve">zai-org/GLM-5.2-TEE</w:t>
+      </w:r>
+      <w:r>
+        <w:t xml:space="preserve">,</w:t>
+      </w:r>
+      <w:r>
+        <w:t xml:space="preserve"> </w:t>
+      </w:r>
+      <w:r>
+        <w:t xml:space="preserve">fast=</w:t>
+      </w:r>
+      <w:r>
+        <w:rPr>
+          <w:rStyle w:val="VerbatimChar"/>
+        </w:rPr>
+        <w:t xml:space="preserve">Qwen/Qwen3.6-27B-TEE</w:t>
+      </w:r>
+      <w:r>
+        <w:t xml:space="preserve">.</w:t>
+      </w:r>
+    </w:p>
+    <w:p>
+      <w:pPr>
+        <w:pStyle w:val="Compact"/>
+        <w:numPr>
+          <w:ilvl w:val="0"/>
+          <w:numId w:val="1045"/>
+        </w:numPr>
+      </w:pPr>
+      <w:r>
+        <w:rPr>
+          <w:b/>
+          <w:bCs/>
+        </w:rPr>
+        <w:t xml:space="preserve">Chutes documentation</w:t>
+      </w:r>
+      <w:r>
+        <w:t xml:space="preserve"> </w:t>
+      </w:r>
+      <w:r>
+        <w:t xml:space="preserve">added to Provider_Aliases_User_Guide.md with full model</w:t>
+      </w:r>
+      <w:r>
+        <w:t xml:space="preserve"> </w:t>
+      </w:r>
+      <w:r>
+        <w:t xml:space="preserve">table, TEE explanation, pay-per-use note, and setup instructions.</w:t>
+      </w:r>
+    </w:p>
+    <w:bookmarkEnd w:id="68"/>
+    <w:bookmarkStart w:id="69" w:name="verified-11"/>
+    <w:p>
+      <w:pPr>
+        <w:pStyle w:val="Heading3"/>
+      </w:pPr>
+      <w:r>
+        <w:t xml:space="preserve">Verified</w:t>
+      </w:r>
+    </w:p>
+    <w:p>
+      <w:pPr>
+        <w:pStyle w:val="Compact"/>
+        <w:numPr>
+          <w:ilvl w:val="0"/>
+          <w:numId w:val="1046"/>
+        </w:numPr>
+      </w:pPr>
+      <w:r>
+        <w:t xml:space="preserve">Chutes API endpoint responds correctly</w:t>
+      </w:r>
+    </w:p>
+    <w:p>
+      <w:pPr>
+        <w:pStyle w:val="Compact"/>
+        <w:numPr>
+          <w:ilvl w:val="0"/>
+          <w:numId w:val="1046"/>
+        </w:numPr>
+      </w:pPr>
+      <w:r>
+        <w:t xml:space="preserve">All 13 TEE models accessible (require funded account for actual inference)</w:t>
+      </w:r>
+    </w:p>
+    <w:p>
+      <w:pPr>
+        <w:pStyle w:val="Compact"/>
+        <w:numPr>
+          <w:ilvl w:val="0"/>
+          <w:numId w:val="1046"/>
+        </w:numPr>
+      </w:pPr>
+      <w:r>
+        <w:t xml:space="preserve">OpenAI-compatible format confirmed at</w:t>
+      </w:r>
+      <w:r>
+        <w:t xml:space="preserve"> </w:t>
+      </w:r>
+      <w:r>
+        <w:rPr>
+          <w:rStyle w:val="VerbatimChar"/>
+        </w:rPr>
+        <w:t xml:space="preserve">https://llm.chutes.ai/v1</w:t>
+      </w:r>
+    </w:p>
+    <w:bookmarkEnd w:id="69"/>
+    <w:bookmarkEnd w:id="70"/>
+    <w:bookmarkStart w:id="74" w:name="X27edce9e35c5d24fd18298996022e3d241784db"/>
+    <w:p>
+      <w:pPr>
+        <w:pStyle w:val="Heading2"/>
+      </w:pPr>
+      <w:r>
         <w:t xml:space="preserve">v1.6.1 — 2026-06-21 — cache_control fix + E2E tests</w:t>
       </w:r>
     </w:p>
-    <w:bookmarkStart w:id="68" w:name="fixed-10"/>
+    <w:bookmarkStart w:id="71" w:name="fixed-10"/>
     <w:p>
       <w:pPr>
         <w:pStyle w:val="Heading3"/>
@@ -8824,7 +9157,7 @@
         <w:pStyle w:val="Compact"/>
         <w:numPr>
           <w:ilvl w:val="0"/>
-          <w:numId w:val="1045"/>
+          <w:numId w:val="1047"/>
         </w:numPr>
       </w:pPr>
       <w:r>
@@ -8919,8 +9252,8 @@
         <w:t xml:space="preserve">before forwarding to the provider.</w:t>
       </w:r>
     </w:p>
-    <w:bookmarkEnd w:id="68"/>
-    <w:bookmarkStart w:id="69" w:name="added-5"/>
+    <w:bookmarkEnd w:id="71"/>
+    <w:bookmarkStart w:id="72" w:name="added-6"/>
     <w:p>
       <w:pPr>
         <w:pStyle w:val="Heading3"/>
@@ -8934,7 +9267,7 @@
         <w:pStyle w:val="Compact"/>
         <w:numPr>
           <w:ilvl w:val="0"/>
-          <w:numId w:val="1046"/>
+          <w:numId w:val="1048"/>
         </w:numPr>
       </w:pPr>
       <w:r>
@@ -8958,8 +9291,8 @@
         <w:t xml:space="preserve">by sending requests through ccr and verifying responses work without errors.</w:t>
       </w:r>
     </w:p>
-    <w:bookmarkEnd w:id="69"/>
-    <w:bookmarkStart w:id="70" w:name="Xbff68b5d42336bf1670d51222efb63545196efe"/>
+    <w:bookmarkEnd w:id="72"/>
+    <w:bookmarkStart w:id="73" w:name="Xbff68b5d42336bf1670d51222efb63545196efe"/>
     <w:p>
       <w:pPr>
         <w:pStyle w:val="Heading3"/>
@@ -8973,7 +9306,7 @@
         <w:pStyle w:val="Compact"/>
         <w:numPr>
           <w:ilvl w:val="0"/>
-          <w:numId w:val="1047"/>
+          <w:numId w:val="1049"/>
         </w:numPr>
       </w:pPr>
       <w:r>
@@ -8994,7 +9327,7 @@
         <w:pStyle w:val="Compact"/>
         <w:numPr>
           <w:ilvl w:val="0"/>
-          <w:numId w:val="1047"/>
+          <w:numId w:val="1049"/>
         </w:numPr>
       </w:pPr>
       <w:r>
@@ -9015,7 +9348,7 @@
         <w:pStyle w:val="Compact"/>
         <w:numPr>
           <w:ilvl w:val="0"/>
-          <w:numId w:val="1047"/>
+          <w:numId w:val="1049"/>
         </w:numPr>
       </w:pPr>
       <w:r>
@@ -9036,7 +9369,7 @@
         <w:pStyle w:val="Compact"/>
         <w:numPr>
           <w:ilvl w:val="0"/>
-          <w:numId w:val="1047"/>
+          <w:numId w:val="1049"/>
         </w:numPr>
       </w:pPr>
       <w:r>
@@ -9057,7 +9390,7 @@
         <w:pStyle w:val="Compact"/>
         <w:numPr>
           <w:ilvl w:val="0"/>
-          <w:numId w:val="1047"/>
+          <w:numId w:val="1049"/>
         </w:numPr>
       </w:pPr>
       <w:r>
@@ -9078,7 +9411,7 @@
         <w:pStyle w:val="Compact"/>
         <w:numPr>
           <w:ilvl w:val="0"/>
-          <w:numId w:val="1047"/>
+          <w:numId w:val="1049"/>
         </w:numPr>
       </w:pPr>
       <w:r>
@@ -9099,7 +9432,7 @@
         <w:pStyle w:val="Compact"/>
         <w:numPr>
           <w:ilvl w:val="0"/>
-          <w:numId w:val="1047"/>
+          <w:numId w:val="1049"/>
         </w:numPr>
       </w:pPr>
       <w:r>
@@ -9115,9 +9448,9 @@
         <w:t xml:space="preserve">(router transport): ✅ YES</w:t>
       </w:r>
     </w:p>
-    <w:bookmarkEnd w:id="70"/>
-    <w:bookmarkEnd w:id="71"/>
-    <w:bookmarkStart w:id="76" w:name="X9d2ee70664c5e82279db4e38681cde47ab497c0"/>
+    <w:bookmarkEnd w:id="73"/>
+    <w:bookmarkEnd w:id="74"/>
+    <w:bookmarkStart w:id="79" w:name="X9d2ee70664c5e82279db4e38681cde47ab497c0"/>
     <w:p>
       <w:pPr>
         <w:pStyle w:val="Heading2"/>
@@ -9126,7 +9459,7 @@
         <w:t xml:space="preserve">v1.6.0 — 2026-06-21 — Multi-alias provider system</w:t>
       </w:r>
     </w:p>
-    <w:bookmarkStart w:id="72" w:name="added-6"/>
+    <w:bookmarkStart w:id="75" w:name="added-7"/>
     <w:p>
       <w:pPr>
         <w:pStyle w:val="Heading3"/>
@@ -9140,7 +9473,7 @@
         <w:pStyle w:val="Compact"/>
         <w:numPr>
           <w:ilvl w:val="0"/>
-          <w:numId w:val="1048"/>
+          <w:numId w:val="1050"/>
         </w:numPr>
       </w:pPr>
       <w:r>
@@ -9207,7 +9540,7 @@
         <w:pStyle w:val="Compact"/>
         <w:numPr>
           <w:ilvl w:val="0"/>
-          <w:numId w:val="1048"/>
+          <w:numId w:val="1050"/>
         </w:numPr>
       </w:pPr>
       <w:r>
@@ -9260,7 +9593,7 @@
         <w:pStyle w:val="Compact"/>
         <w:numPr>
           <w:ilvl w:val="0"/>
-          <w:numId w:val="1048"/>
+          <w:numId w:val="1050"/>
         </w:numPr>
       </w:pPr>
       <w:r>
@@ -9301,7 +9634,7 @@
         <w:pStyle w:val="Compact"/>
         <w:numPr>
           <w:ilvl w:val="0"/>
-          <w:numId w:val="1048"/>
+          <w:numId w:val="1050"/>
         </w:numPr>
       </w:pPr>
       <w:r>
@@ -9390,7 +9723,7 @@
         <w:pStyle w:val="Compact"/>
         <w:numPr>
           <w:ilvl w:val="0"/>
-          <w:numId w:val="1048"/>
+          <w:numId w:val="1050"/>
         </w:numPr>
       </w:pPr>
       <w:r>
@@ -9448,7 +9781,7 @@
         <w:pStyle w:val="Compact"/>
         <w:numPr>
           <w:ilvl w:val="0"/>
-          <w:numId w:val="1048"/>
+          <w:numId w:val="1050"/>
         </w:numPr>
       </w:pPr>
       <w:r>
@@ -9477,8 +9810,8 @@
         <w:t xml:space="preserve">containers (deploy-stack).</w:t>
       </w:r>
     </w:p>
-    <w:bookmarkEnd w:id="72"/>
-    <w:bookmarkStart w:id="73" w:name="changed-2"/>
+    <w:bookmarkEnd w:id="75"/>
+    <w:bookmarkStart w:id="76" w:name="changed-2"/>
     <w:p>
       <w:pPr>
         <w:pStyle w:val="Heading3"/>
@@ -9492,7 +9825,7 @@
         <w:pStyle w:val="Compact"/>
         <w:numPr>
           <w:ilvl w:val="0"/>
-          <w:numId w:val="1049"/>
+          <w:numId w:val="1051"/>
         </w:numPr>
       </w:pPr>
       <w:r>
@@ -9525,7 +9858,7 @@
         <w:pStyle w:val="Compact"/>
         <w:numPr>
           <w:ilvl w:val="0"/>
-          <w:numId w:val="1049"/>
+          <w:numId w:val="1051"/>
         </w:numPr>
       </w:pPr>
       <w:r>
@@ -9541,8 +9874,8 @@
         <w:t xml:space="preserve">header added to HTTP probes (some APIs require it).</w:t>
       </w:r>
     </w:p>
-    <w:bookmarkEnd w:id="73"/>
-    <w:bookmarkStart w:id="74" w:name="full-test-suite"/>
+    <w:bookmarkEnd w:id="76"/>
+    <w:bookmarkStart w:id="77" w:name="full-test-suite"/>
     <w:p>
       <w:pPr>
         <w:pStyle w:val="Heading3"/>
@@ -9556,15 +9889,15 @@
         <w:pStyle w:val="Compact"/>
         <w:numPr>
           <w:ilvl w:val="0"/>
-          <w:numId w:val="1050"/>
+          <w:numId w:val="1052"/>
         </w:numPr>
       </w:pPr>
       <w:r>
         <w:t xml:space="preserve">8/8 test files passed (ALL GREEN), 0 failures.</w:t>
       </w:r>
     </w:p>
-    <w:bookmarkEnd w:id="74"/>
-    <w:bookmarkStart w:id="75" w:name="usage"/>
+    <w:bookmarkEnd w:id="77"/>
+    <w:bookmarkStart w:id="78" w:name="usage"/>
     <w:p>
       <w:pPr>
         <w:pStyle w:val="Heading3"/>
@@ -9695,9 +10028,9 @@
         <w:t xml:space="preserve"> 20</w:t>
       </w:r>
     </w:p>
-    <w:bookmarkEnd w:id="75"/>
-    <w:bookmarkEnd w:id="76"/>
-    <w:bookmarkStart w:id="80" w:name="X61398dabc5de246fbceb16295c0968ea2c76ebe"/>
+    <w:bookmarkEnd w:id="78"/>
+    <w:bookmarkEnd w:id="79"/>
+    <w:bookmarkStart w:id="83" w:name="X61398dabc5de246fbceb16295c0968ea2c76ebe"/>
     <w:p>
       <w:pPr>
         <w:pStyle w:val="Heading2"/>
@@ -9706,7 +10039,7 @@
         <w:t xml:space="preserve">v1.5.1 — 2026-06-20 — Linux stat fix + nezha deployment</w:t>
       </w:r>
     </w:p>
-    <w:bookmarkStart w:id="77" w:name="fixed-11"/>
+    <w:bookmarkStart w:id="80" w:name="fixed-11"/>
     <w:p>
       <w:pPr>
         <w:pStyle w:val="Heading3"/>
@@ -9720,7 +10053,7 @@
         <w:pStyle w:val="Compact"/>
         <w:numPr>
           <w:ilvl w:val="0"/>
-          <w:numId w:val="1051"/>
+          <w:numId w:val="1053"/>
         </w:numPr>
       </w:pPr>
       <w:r>
@@ -9881,8 +10214,8 @@
         <w:t xml:space="preserve">to pick the correct flag per platform.</w:t>
       </w:r>
     </w:p>
-    <w:bookmarkEnd w:id="77"/>
-    <w:bookmarkStart w:id="78" w:name="deployment"/>
+    <w:bookmarkEnd w:id="80"/>
+    <w:bookmarkStart w:id="81" w:name="deployment"/>
     <w:p>
       <w:pPr>
         <w:pStyle w:val="Heading3"/>
@@ -9896,7 +10229,7 @@
         <w:pStyle w:val="Compact"/>
         <w:numPr>
           <w:ilvl w:val="0"/>
-          <w:numId w:val="1052"/>
+          <w:numId w:val="1054"/>
         </w:numPr>
       </w:pPr>
       <w:r>
@@ -9937,8 +10270,8 @@
         <w:t xml:space="preserve">.</w:t>
       </w:r>
     </w:p>
-    <w:bookmarkEnd w:id="78"/>
-    <w:bookmarkStart w:id="79" w:name="full-test-suite-1"/>
+    <w:bookmarkEnd w:id="81"/>
+    <w:bookmarkStart w:id="82" w:name="full-test-suite-1"/>
     <w:p>
       <w:pPr>
         <w:pStyle w:val="Heading3"/>
@@ -9952,7 +10285,7 @@
         <w:pStyle w:val="Compact"/>
         <w:numPr>
           <w:ilvl w:val="0"/>
-          <w:numId w:val="1053"/>
+          <w:numId w:val="1055"/>
         </w:numPr>
       </w:pPr>
       <w:r>
@@ -9964,16 +10297,16 @@
         <w:pStyle w:val="Compact"/>
         <w:numPr>
           <w:ilvl w:val="0"/>
-          <w:numId w:val="1053"/>
+          <w:numId w:val="1055"/>
         </w:numPr>
       </w:pPr>
       <w:r>
         <w:t xml:space="preserve">Linux (nezha): 7/8 pass (export fails: pandoc not installed — pre-existing)</w:t>
       </w:r>
     </w:p>
-    <w:bookmarkEnd w:id="79"/>
-    <w:bookmarkEnd w:id="80"/>
-    <w:bookmarkStart w:id="86" w:name="X5ad0f70f3980797749c315bc1bf8b5a98a591cc"/>
+    <w:bookmarkEnd w:id="82"/>
+    <w:bookmarkEnd w:id="83"/>
+    <w:bookmarkStart w:id="89" w:name="X5ad0f70f3980797749c315bc1bf8b5a98a591cc"/>
     <w:p>
       <w:pPr>
         <w:pStyle w:val="Heading2"/>
@@ -9982,7 +10315,7 @@
         <w:t xml:space="preserve">v1.5.0 — 2026-06-20 — Cross-alias session visibility</w:t>
       </w:r>
     </w:p>
-    <w:bookmarkStart w:id="81" w:name="added-7"/>
+    <w:bookmarkStart w:id="84" w:name="added-8"/>
     <w:p>
       <w:pPr>
         <w:pStyle w:val="Heading3"/>
@@ -9996,7 +10329,7 @@
         <w:pStyle w:val="Compact"/>
         <w:numPr>
           <w:ilvl w:val="0"/>
-          <w:numId w:val="1054"/>
+          <w:numId w:val="1056"/>
         </w:numPr>
       </w:pPr>
       <w:r>
@@ -10087,7 +10420,7 @@
         <w:pStyle w:val="Compact"/>
         <w:numPr>
           <w:ilvl w:val="0"/>
-          <w:numId w:val="1054"/>
+          <w:numId w:val="1056"/>
         </w:numPr>
       </w:pPr>
       <w:r>
@@ -10166,7 +10499,7 @@
         <w:pStyle w:val="Compact"/>
         <w:numPr>
           <w:ilvl w:val="0"/>
-          <w:numId w:val="1054"/>
+          <w:numId w:val="1056"/>
         </w:numPr>
       </w:pPr>
       <w:r>
@@ -10260,7 +10593,7 @@
         <w:pStyle w:val="Compact"/>
         <w:numPr>
           <w:ilvl w:val="0"/>
-          <w:numId w:val="1054"/>
+          <w:numId w:val="1056"/>
         </w:numPr>
       </w:pPr>
       <w:r>
@@ -10291,7 +10624,7 @@
         <w:pStyle w:val="Compact"/>
         <w:numPr>
           <w:ilvl w:val="0"/>
-          <w:numId w:val="1054"/>
+          <w:numId w:val="1056"/>
         </w:numPr>
       </w:pPr>
       <w:r>
@@ -10356,8 +10689,8 @@
         <w:t xml:space="preserve">.</w:t>
       </w:r>
     </w:p>
-    <w:bookmarkEnd w:id="81"/>
-    <w:bookmarkStart w:id="82" w:name="changed-3"/>
+    <w:bookmarkEnd w:id="84"/>
+    <w:bookmarkStart w:id="85" w:name="changed-3"/>
     <w:p>
       <w:pPr>
         <w:pStyle w:val="Heading3"/>
@@ -10371,7 +10704,7 @@
         <w:pStyle w:val="Compact"/>
         <w:numPr>
           <w:ilvl w:val="0"/>
-          <w:numId w:val="1055"/>
+          <w:numId w:val="1057"/>
         </w:numPr>
       </w:pPr>
       <w:r>
@@ -10392,7 +10725,7 @@
         <w:pStyle w:val="Compact"/>
         <w:numPr>
           <w:ilvl w:val="0"/>
-          <w:numId w:val="1055"/>
+          <w:numId w:val="1057"/>
         </w:numPr>
       </w:pPr>
       <w:r>
@@ -10428,7 +10761,7 @@
         <w:pStyle w:val="Compact"/>
         <w:numPr>
           <w:ilvl w:val="0"/>
-          <w:numId w:val="1055"/>
+          <w:numId w:val="1057"/>
         </w:numPr>
       </w:pPr>
       <w:r>
@@ -10465,8 +10798,8 @@
         <w:t xml:space="preserve">function (re-installed)</w:t>
       </w:r>
     </w:p>
-    <w:bookmarkEnd w:id="82"/>
-    <w:bookmarkStart w:id="83" w:name="full-test-suite-2"/>
+    <w:bookmarkEnd w:id="85"/>
+    <w:bookmarkStart w:id="86" w:name="full-test-suite-2"/>
     <w:p>
       <w:pPr>
         <w:pStyle w:val="Heading3"/>
@@ -10480,7 +10813,7 @@
         <w:pStyle w:val="Compact"/>
         <w:numPr>
           <w:ilvl w:val="0"/>
-          <w:numId w:val="1056"/>
+          <w:numId w:val="1058"/>
         </w:numPr>
       </w:pPr>
       <w:r>
@@ -10493,8 +10826,8 @@
         <w:t xml:space="preserve">assertions for cross-alias session visibility.</w:t>
       </w:r>
     </w:p>
-    <w:bookmarkEnd w:id="83"/>
-    <w:bookmarkStart w:id="84" w:name="how-it-works"/>
+    <w:bookmarkEnd w:id="86"/>
+    <w:bookmarkStart w:id="87" w:name="how-it-works"/>
     <w:p>
       <w:pPr>
         <w:pStyle w:val="Heading3"/>
@@ -10508,7 +10841,7 @@
         <w:pStyle w:val="Compact"/>
         <w:numPr>
           <w:ilvl w:val="0"/>
-          <w:numId w:val="1057"/>
+          <w:numId w:val="1059"/>
         </w:numPr>
       </w:pPr>
       <w:r>
@@ -10574,7 +10907,7 @@
         <w:pStyle w:val="Compact"/>
         <w:numPr>
           <w:ilvl w:val="0"/>
-          <w:numId w:val="1057"/>
+          <w:numId w:val="1059"/>
         </w:numPr>
       </w:pPr>
       <w:r>
@@ -10601,7 +10934,7 @@
         <w:pStyle w:val="Compact"/>
         <w:numPr>
           <w:ilvl w:val="0"/>
-          <w:numId w:val="1057"/>
+          <w:numId w:val="1059"/>
         </w:numPr>
       </w:pPr>
       <w:r>
@@ -10643,7 +10976,7 @@
         <w:pStyle w:val="Compact"/>
         <w:numPr>
           <w:ilvl w:val="0"/>
-          <w:numId w:val="1057"/>
+          <w:numId w:val="1059"/>
         </w:numPr>
       </w:pPr>
       <w:r>
@@ -10680,8 +11013,8 @@
         <w:t xml:space="preserve">project settings are also merged.</w:t>
       </w:r>
     </w:p>
-    <w:bookmarkEnd w:id="84"/>
-    <w:bookmarkStart w:id="85" w:name="performance"/>
+    <w:bookmarkEnd w:id="87"/>
+    <w:bookmarkStart w:id="88" w:name="performance"/>
     <w:p>
       <w:pPr>
         <w:pStyle w:val="Heading3"/>
@@ -10695,7 +11028,7 @@
         <w:pStyle w:val="Compact"/>
         <w:numPr>
           <w:ilvl w:val="0"/>
-          <w:numId w:val="1058"/>
+          <w:numId w:val="1060"/>
         </w:numPr>
       </w:pPr>
       <w:r>
@@ -10738,9 +11071,9 @@
         <w:t xml:space="preserve">aliases already have.</w:t>
       </w:r>
     </w:p>
-    <w:bookmarkEnd w:id="85"/>
-    <w:bookmarkEnd w:id="86"/>
-    <w:bookmarkStart w:id="92" w:name="X94bd8505e6816e99bb68c98ba9db4e75c90bada"/>
+    <w:bookmarkEnd w:id="88"/>
+    <w:bookmarkEnd w:id="89"/>
+    <w:bookmarkStart w:id="95" w:name="X94bd8505e6816e99bb68c98ba9db4e75c90bada"/>
     <w:p>
       <w:pPr>
         <w:pStyle w:val="Heading2"/>
@@ -10749,7 +11082,7 @@
         <w:t xml:space="preserve">v1.4.0 — 2026-06-20 — OpenCode Zen provider alias</w:t>
       </w:r>
     </w:p>
-    <w:bookmarkStart w:id="88" w:name="added-8"/>
+    <w:bookmarkStart w:id="91" w:name="added-9"/>
     <w:p>
       <w:pPr>
         <w:pStyle w:val="Heading3"/>
@@ -10763,7 +11096,7 @@
         <w:pStyle w:val="Compact"/>
         <w:numPr>
           <w:ilvl w:val="0"/>
-          <w:numId w:val="1059"/>
+          <w:numId w:val="1061"/>
         </w:numPr>
       </w:pPr>
       <w:r>
@@ -10797,7 +11130,7 @@
       <w:r>
         <w:t xml:space="preserve"> </w:t>
       </w:r>
-      <w:hyperlink r:id="rId87">
+      <w:hyperlink r:id="rId90">
         <w:r>
           <w:rPr>
             <w:rStyle w:val="Hyperlink"/>
@@ -10879,7 +11212,7 @@
         <w:pStyle w:val="Compact"/>
         <w:numPr>
           <w:ilvl w:val="0"/>
-          <w:numId w:val="1059"/>
+          <w:numId w:val="1061"/>
         </w:numPr>
       </w:pPr>
       <w:r>
@@ -10976,7 +11309,7 @@
         <w:pStyle w:val="Compact"/>
         <w:numPr>
           <w:ilvl w:val="0"/>
-          <w:numId w:val="1059"/>
+          <w:numId w:val="1061"/>
         </w:numPr>
       </w:pPr>
       <w:r>
@@ -11055,7 +11388,7 @@
         <w:pStyle w:val="Compact"/>
         <w:numPr>
           <w:ilvl w:val="0"/>
-          <w:numId w:val="1059"/>
+          <w:numId w:val="1061"/>
         </w:numPr>
       </w:pPr>
       <w:r>
@@ -11101,7 +11434,7 @@
         <w:pStyle w:val="Compact"/>
         <w:numPr>
           <w:ilvl w:val="0"/>
-          <w:numId w:val="1059"/>
+          <w:numId w:val="1061"/>
         </w:numPr>
       </w:pPr>
       <w:r>
@@ -11159,7 +11492,7 @@
         <w:pStyle w:val="Compact"/>
         <w:numPr>
           <w:ilvl w:val="0"/>
-          <w:numId w:val="1059"/>
+          <w:numId w:val="1061"/>
         </w:numPr>
       </w:pPr>
       <w:r>
@@ -11304,7 +11637,7 @@
         <w:pStyle w:val="Compact"/>
         <w:numPr>
           <w:ilvl w:val="0"/>
-          <w:numId w:val="1059"/>
+          <w:numId w:val="1061"/>
         </w:numPr>
       </w:pPr>
       <w:r>
@@ -11348,8 +11681,8 @@
         <w:t xml:space="preserve">(full free models table, setup, usage, live-verified notes, stealth model explanation).</w:t>
       </w:r>
     </w:p>
-    <w:bookmarkEnd w:id="88"/>
-    <w:bookmarkStart w:id="89" w:name="changed-4"/>
+    <w:bookmarkEnd w:id="91"/>
+    <w:bookmarkStart w:id="92" w:name="changed-4"/>
     <w:p>
       <w:pPr>
         <w:pStyle w:val="Heading3"/>
@@ -11363,7 +11696,7 @@
         <w:pStyle w:val="Compact"/>
         <w:numPr>
           <w:ilvl w:val="0"/>
-          <w:numId w:val="1060"/>
+          <w:numId w:val="1062"/>
         </w:numPr>
       </w:pPr>
       <w:r>
@@ -11421,8 +11754,8 @@
         <w:t xml:space="preserve">Xiaomi v1.3.0 / Z.AI v1.2.0 / DeepSeek).</w:t>
       </w:r>
     </w:p>
-    <w:bookmarkEnd w:id="89"/>
-    <w:bookmarkStart w:id="90" w:name="full-test-suite-3"/>
+    <w:bookmarkEnd w:id="92"/>
+    <w:bookmarkStart w:id="93" w:name="full-test-suite-3"/>
     <w:p>
       <w:pPr>
         <w:pStyle w:val="Heading3"/>
@@ -11436,7 +11769,7 @@
         <w:pStyle w:val="Compact"/>
         <w:numPr>
           <w:ilvl w:val="0"/>
-          <w:numId w:val="1061"/>
+          <w:numId w:val="1063"/>
         </w:numPr>
       </w:pPr>
       <w:r>
@@ -11461,8 +11794,8 @@
         <w:t xml:space="preserve">.</w:t>
       </w:r>
     </w:p>
-    <w:bookmarkEnd w:id="90"/>
-    <w:bookmarkStart w:id="91" w:name="honest-notes"/>
+    <w:bookmarkEnd w:id="93"/>
+    <w:bookmarkStart w:id="94" w:name="honest-notes"/>
     <w:p>
       <w:pPr>
         <w:pStyle w:val="Heading3"/>
@@ -11476,7 +11809,7 @@
         <w:pStyle w:val="Compact"/>
         <w:numPr>
           <w:ilvl w:val="0"/>
-          <w:numId w:val="1062"/>
+          <w:numId w:val="1064"/>
         </w:numPr>
       </w:pPr>
       <w:r>
@@ -11509,7 +11842,7 @@
         <w:pStyle w:val="Compact"/>
         <w:numPr>
           <w:ilvl w:val="0"/>
-          <w:numId w:val="1062"/>
+          <w:numId w:val="1064"/>
         </w:numPr>
       </w:pPr>
       <w:r>
@@ -11527,7 +11860,7 @@
         <w:pStyle w:val="Compact"/>
         <w:numPr>
           <w:ilvl w:val="0"/>
-          <w:numId w:val="1062"/>
+          <w:numId w:val="1064"/>
         </w:numPr>
       </w:pPr>
       <w:r>
@@ -11560,7 +11893,7 @@
         <w:pStyle w:val="Compact"/>
         <w:numPr>
           <w:ilvl w:val="0"/>
-          <w:numId w:val="1062"/>
+          <w:numId w:val="1064"/>
         </w:numPr>
       </w:pPr>
       <w:r>
@@ -11582,9 +11915,9 @@
         <w:t xml:space="preserve">remain unchanged (unrelated to this work).</w:t>
       </w:r>
     </w:p>
-    <w:bookmarkEnd w:id="91"/>
-    <w:bookmarkEnd w:id="92"/>
-    <w:bookmarkStart w:id="97" w:name="X69154bd52ce827bc58cd09d02c5408ae11d24a9"/>
+    <w:bookmarkEnd w:id="94"/>
+    <w:bookmarkEnd w:id="95"/>
+    <w:bookmarkStart w:id="100" w:name="X69154bd52ce827bc58cd09d02c5408ae11d24a9"/>
     <w:p>
       <w:pPr>
         <w:pStyle w:val="Heading2"/>
@@ -11593,7 +11926,7 @@
         <w:t xml:space="preserve">v1.3.0 — 2026-06-19 — Xiaomi MiMo provider alias</w:t>
       </w:r>
     </w:p>
-    <w:bookmarkStart w:id="93" w:name="added-9"/>
+    <w:bookmarkStart w:id="96" w:name="added-10"/>
     <w:p>
       <w:pPr>
         <w:pStyle w:val="Heading3"/>
@@ -11607,7 +11940,7 @@
         <w:pStyle w:val="Compact"/>
         <w:numPr>
           <w:ilvl w:val="0"/>
-          <w:numId w:val="1063"/>
+          <w:numId w:val="1065"/>
         </w:numPr>
       </w:pPr>
       <w:r>
@@ -11754,7 +12087,7 @@
         <w:pStyle w:val="Compact"/>
         <w:numPr>
           <w:ilvl w:val="0"/>
-          <w:numId w:val="1063"/>
+          <w:numId w:val="1065"/>
         </w:numPr>
       </w:pPr>
       <w:r>
@@ -11849,7 +12182,7 @@
         <w:pStyle w:val="Compact"/>
         <w:numPr>
           <w:ilvl w:val="0"/>
-          <w:numId w:val="1063"/>
+          <w:numId w:val="1065"/>
         </w:numPr>
       </w:pPr>
       <w:r>
@@ -11919,7 +12252,7 @@
         <w:pStyle w:val="Compact"/>
         <w:numPr>
           <w:ilvl w:val="0"/>
-          <w:numId w:val="1063"/>
+          <w:numId w:val="1065"/>
         </w:numPr>
       </w:pPr>
       <w:r>
@@ -11980,7 +12313,7 @@
         <w:pStyle w:val="Compact"/>
         <w:numPr>
           <w:ilvl w:val="0"/>
-          <w:numId w:val="1063"/>
+          <w:numId w:val="1065"/>
         </w:numPr>
       </w:pPr>
       <w:r>
@@ -12059,7 +12392,7 @@
         <w:pStyle w:val="Compact"/>
         <w:numPr>
           <w:ilvl w:val="0"/>
-          <w:numId w:val="1063"/>
+          <w:numId w:val="1065"/>
         </w:numPr>
       </w:pPr>
       <w:r>
@@ -12141,7 +12474,7 @@
         <w:pStyle w:val="Compact"/>
         <w:numPr>
           <w:ilvl w:val="1"/>
-          <w:numId w:val="1064"/>
+          <w:numId w:val="1066"/>
         </w:numPr>
       </w:pPr>
       <w:r>
@@ -12174,7 +12507,7 @@
         <w:pStyle w:val="Compact"/>
         <w:numPr>
           <w:ilvl w:val="0"/>
-          <w:numId w:val="1063"/>
+          <w:numId w:val="1065"/>
         </w:numPr>
       </w:pPr>
       <w:r>
@@ -12218,8 +12551,8 @@
         <w:t xml:space="preserve">(model table, setup, usage, live-verified notes).</w:t>
       </w:r>
     </w:p>
-    <w:bookmarkEnd w:id="93"/>
-    <w:bookmarkStart w:id="94" w:name="changed-5"/>
+    <w:bookmarkEnd w:id="96"/>
+    <w:bookmarkStart w:id="97" w:name="changed-5"/>
     <w:p>
       <w:pPr>
         <w:pStyle w:val="Heading3"/>
@@ -12233,7 +12566,7 @@
         <w:pStyle w:val="Compact"/>
         <w:numPr>
           <w:ilvl w:val="0"/>
-          <w:numId w:val="1065"/>
+          <w:numId w:val="1067"/>
         </w:numPr>
       </w:pPr>
       <w:r>
@@ -12291,8 +12624,8 @@
         <w:t xml:space="preserve">Z.AI v1.2.0 / DeepSeek).</w:t>
       </w:r>
     </w:p>
-    <w:bookmarkEnd w:id="94"/>
-    <w:bookmarkStart w:id="95" w:name="full-test-suite-4"/>
+    <w:bookmarkEnd w:id="97"/>
+    <w:bookmarkStart w:id="98" w:name="full-test-suite-4"/>
     <w:p>
       <w:pPr>
         <w:pStyle w:val="Heading3"/>
@@ -12306,7 +12639,7 @@
         <w:pStyle w:val="Compact"/>
         <w:numPr>
           <w:ilvl w:val="0"/>
-          <w:numId w:val="1066"/>
+          <w:numId w:val="1068"/>
         </w:numPr>
       </w:pPr>
       <w:r>
@@ -12331,8 +12664,8 @@
         <w:t xml:space="preserve">. Live provider verifier 5/5 PASS.</w:t>
       </w:r>
     </w:p>
-    <w:bookmarkEnd w:id="95"/>
-    <w:bookmarkStart w:id="96" w:name="honest-notes-1"/>
+    <w:bookmarkEnd w:id="98"/>
+    <w:bookmarkStart w:id="99" w:name="honest-notes-1"/>
     <w:p>
       <w:pPr>
         <w:pStyle w:val="Heading3"/>
@@ -12346,7 +12679,7 @@
         <w:pStyle w:val="Compact"/>
         <w:numPr>
           <w:ilvl w:val="0"/>
-          <w:numId w:val="1067"/>
+          <w:numId w:val="1069"/>
         </w:numPr>
       </w:pPr>
       <w:r>
@@ -12395,7 +12728,7 @@
         <w:pStyle w:val="Compact"/>
         <w:numPr>
           <w:ilvl w:val="0"/>
-          <w:numId w:val="1067"/>
+          <w:numId w:val="1069"/>
         </w:numPr>
       </w:pPr>
       <w:r>
@@ -12471,9 +12804,9 @@
         <w:t xml:space="preserve">round trip (HTTP 200), recorded in the evidence file.</w:t>
       </w:r>
     </w:p>
-    <w:bookmarkEnd w:id="96"/>
-    <w:bookmarkEnd w:id="97"/>
-    <w:bookmarkStart w:id="101" w:name="X6f75f912364272564da9bd72c339309408e0f52"/>
+    <w:bookmarkEnd w:id="99"/>
+    <w:bookmarkEnd w:id="100"/>
+    <w:bookmarkStart w:id="104" w:name="X6f75f912364272564da9bd72c339309408e0f52"/>
     <w:p>
       <w:pPr>
         <w:pStyle w:val="Heading2"/>
@@ -12482,7 +12815,7 @@
         <w:t xml:space="preserve">v1.2.0 — 2026-06-19 — Z.AI Coding Plan provider alias</w:t>
       </w:r>
     </w:p>
-    <w:bookmarkStart w:id="98" w:name="added-10"/>
+    <w:bookmarkStart w:id="101" w:name="added-11"/>
     <w:p>
       <w:pPr>
         <w:pStyle w:val="Heading3"/>
@@ -12496,7 +12829,7 @@
         <w:pStyle w:val="Compact"/>
         <w:numPr>
           <w:ilvl w:val="0"/>
-          <w:numId w:val="1068"/>
+          <w:numId w:val="1070"/>
         </w:numPr>
       </w:pPr>
       <w:r>
@@ -12548,7 +12881,7 @@
         <w:pStyle w:val="Compact"/>
         <w:numPr>
           <w:ilvl w:val="0"/>
-          <w:numId w:val="1068"/>
+          <w:numId w:val="1070"/>
         </w:numPr>
       </w:pPr>
       <w:r>
@@ -12597,7 +12930,7 @@
         <w:pStyle w:val="Compact"/>
         <w:numPr>
           <w:ilvl w:val="0"/>
-          <w:numId w:val="1068"/>
+          <w:numId w:val="1070"/>
         </w:numPr>
       </w:pPr>
       <w:r>
@@ -12661,7 +12994,7 @@
         <w:pStyle w:val="Compact"/>
         <w:numPr>
           <w:ilvl w:val="0"/>
-          <w:numId w:val="1068"/>
+          <w:numId w:val="1070"/>
         </w:numPr>
       </w:pPr>
       <w:r>
@@ -12680,7 +13013,7 @@
         <w:pStyle w:val="Compact"/>
         <w:numPr>
           <w:ilvl w:val="0"/>
-          <w:numId w:val="1068"/>
+          <w:numId w:val="1070"/>
         </w:numPr>
       </w:pPr>
       <w:r>
@@ -12699,7 +13032,7 @@
         <w:pStyle w:val="Compact"/>
         <w:numPr>
           <w:ilvl w:val="0"/>
-          <w:numId w:val="1068"/>
+          <w:numId w:val="1070"/>
         </w:numPr>
       </w:pPr>
       <w:r>
@@ -12748,7 +13081,7 @@
         <w:pStyle w:val="Compact"/>
         <w:numPr>
           <w:ilvl w:val="0"/>
-          <w:numId w:val="1068"/>
+          <w:numId w:val="1070"/>
         </w:numPr>
       </w:pPr>
       <w:r>
@@ -12777,8 +13110,8 @@
         <w:t xml:space="preserve">as the active default route.</w:t>
       </w:r>
     </w:p>
-    <w:bookmarkEnd w:id="98"/>
-    <w:bookmarkStart w:id="99" w:name="changed-6"/>
+    <w:bookmarkEnd w:id="101"/>
+    <w:bookmarkStart w:id="102" w:name="changed-6"/>
     <w:p>
       <w:pPr>
         <w:pStyle w:val="Heading3"/>
@@ -12792,7 +13125,7 @@
         <w:pStyle w:val="Compact"/>
         <w:numPr>
           <w:ilvl w:val="0"/>
-          <w:numId w:val="1069"/>
+          <w:numId w:val="1071"/>
         </w:numPr>
       </w:pPr>
       <w:r>
@@ -12823,8 +13156,8 @@
         <w:t xml:space="preserve">section for model pinning.</w:t>
       </w:r>
     </w:p>
-    <w:bookmarkEnd w:id="99"/>
-    <w:bookmarkStart w:id="100" w:name="full-test-suite-5"/>
+    <w:bookmarkEnd w:id="102"/>
+    <w:bookmarkStart w:id="103" w:name="full-test-suite-5"/>
     <w:p>
       <w:pPr>
         <w:pStyle w:val="Heading3"/>
@@ -12838,7 +13171,7 @@
         <w:pStyle w:val="Compact"/>
         <w:numPr>
           <w:ilvl w:val="0"/>
-          <w:numId w:val="1070"/>
+          <w:numId w:val="1072"/>
         </w:numPr>
       </w:pPr>
       <w:r>
@@ -12857,9 +13190,9 @@
         <w:t xml:space="preserve">.</w:t>
       </w:r>
     </w:p>
-    <w:bookmarkEnd w:id="100"/>
-    <w:bookmarkEnd w:id="101"/>
-    <w:bookmarkStart w:id="107" w:name="X3eea89613e529bc4636accf1a8153b58db87eca"/>
+    <w:bookmarkEnd w:id="103"/>
+    <w:bookmarkEnd w:id="104"/>
+    <w:bookmarkStart w:id="110" w:name="X3eea89613e529bc4636accf1a8153b58db87eca"/>
     <w:p>
       <w:pPr>
         <w:pStyle w:val="Heading2"/>
@@ -12901,7 +13234,7 @@
         <w:t xml:space="preserve">aliases proven on two hosts and two transports.</w:t>
       </w:r>
     </w:p>
-    <w:bookmarkStart w:id="102" w:name="added-11"/>
+    <w:bookmarkStart w:id="105" w:name="added-12"/>
     <w:p>
       <w:pPr>
         <w:pStyle w:val="Heading3"/>
@@ -12915,7 +13248,7 @@
         <w:pStyle w:val="Compact"/>
         <w:numPr>
           <w:ilvl w:val="0"/>
-          <w:numId w:val="1071"/>
+          <w:numId w:val="1073"/>
         </w:numPr>
       </w:pPr>
       <w:r>
@@ -13026,7 +13359,7 @@
         <w:pStyle w:val="Compact"/>
         <w:numPr>
           <w:ilvl w:val="0"/>
-          <w:numId w:val="1071"/>
+          <w:numId w:val="1073"/>
         </w:numPr>
       </w:pPr>
       <w:r>
@@ -13078,7 +13411,7 @@
         <w:pStyle w:val="Compact"/>
         <w:numPr>
           <w:ilvl w:val="0"/>
-          <w:numId w:val="1071"/>
+          <w:numId w:val="1073"/>
         </w:numPr>
       </w:pPr>
       <w:r>
@@ -13109,7 +13442,7 @@
         <w:pStyle w:val="Compact"/>
         <w:numPr>
           <w:ilvl w:val="1"/>
-          <w:numId w:val="1072"/>
+          <w:numId w:val="1074"/>
         </w:numPr>
       </w:pPr>
       <w:r>
@@ -13160,7 +13493,7 @@
         <w:pStyle w:val="Compact"/>
         <w:numPr>
           <w:ilvl w:val="1"/>
-          <w:numId w:val="1072"/>
+          <w:numId w:val="1074"/>
         </w:numPr>
       </w:pPr>
       <w:r>
@@ -13203,7 +13536,7 @@
         <w:pStyle w:val="Compact"/>
         <w:numPr>
           <w:ilvl w:val="1"/>
-          <w:numId w:val="1072"/>
+          <w:numId w:val="1074"/>
         </w:numPr>
       </w:pPr>
       <w:r>
@@ -13260,7 +13593,7 @@
         <w:pStyle w:val="Compact"/>
         <w:numPr>
           <w:ilvl w:val="1"/>
-          <w:numId w:val="1072"/>
+          <w:numId w:val="1074"/>
         </w:numPr>
       </w:pPr>
       <w:r>
@@ -13281,7 +13614,7 @@
         <w:pStyle w:val="Compact"/>
         <w:numPr>
           <w:ilvl w:val="0"/>
-          <w:numId w:val="1071"/>
+          <w:numId w:val="1073"/>
         </w:numPr>
       </w:pPr>
       <w:r>
@@ -13337,7 +13670,7 @@
         <w:pStyle w:val="Compact"/>
         <w:numPr>
           <w:ilvl w:val="0"/>
-          <w:numId w:val="1071"/>
+          <w:numId w:val="1073"/>
         </w:numPr>
       </w:pPr>
       <w:r>
@@ -13375,8 +13708,8 @@
         <w:t xml:space="preserve">end-to-end alias proofs.</w:t>
       </w:r>
     </w:p>
-    <w:bookmarkEnd w:id="102"/>
-    <w:bookmarkStart w:id="103" w:name="changed-7"/>
+    <w:bookmarkEnd w:id="105"/>
+    <w:bookmarkStart w:id="106" w:name="changed-7"/>
     <w:p>
       <w:pPr>
         <w:pStyle w:val="Heading3"/>
@@ -13390,7 +13723,7 @@
         <w:pStyle w:val="Compact"/>
         <w:numPr>
           <w:ilvl w:val="0"/>
-          <w:numId w:val="1073"/>
+          <w:numId w:val="1075"/>
         </w:numPr>
       </w:pPr>
       <w:r>
@@ -13451,7 +13784,7 @@
         <w:pStyle w:val="Compact"/>
         <w:numPr>
           <w:ilvl w:val="0"/>
-          <w:numId w:val="1073"/>
+          <w:numId w:val="1075"/>
         </w:numPr>
       </w:pPr>
       <w:r>
@@ -13502,7 +13835,7 @@
         <w:pStyle w:val="Compact"/>
         <w:numPr>
           <w:ilvl w:val="0"/>
-          <w:numId w:val="1073"/>
+          <w:numId w:val="1075"/>
         </w:numPr>
       </w:pPr>
       <w:r>
@@ -13534,8 +13867,8 @@
         <w:t xml:space="preserve">(HTML/PDF/DOCX).</w:t>
       </w:r>
     </w:p>
-    <w:bookmarkEnd w:id="103"/>
-    <w:bookmarkStart w:id="104" w:name="X08528e409e6d44ab0933f6ae15548960525d0be"/>
+    <w:bookmarkEnd w:id="106"/>
+    <w:bookmarkStart w:id="107" w:name="X08528e409e6d44ab0933f6ae15548960525d0be"/>
     <w:p>
       <w:pPr>
         <w:pStyle w:val="Heading3"/>
@@ -13549,7 +13882,7 @@
         <w:pStyle w:val="Compact"/>
         <w:numPr>
           <w:ilvl w:val="0"/>
-          <w:numId w:val="1074"/>
+          <w:numId w:val="1076"/>
         </w:numPr>
       </w:pPr>
       <w:r>
@@ -13598,7 +13931,7 @@
         <w:pStyle w:val="Compact"/>
         <w:numPr>
           <w:ilvl w:val="0"/>
-          <w:numId w:val="1074"/>
+          <w:numId w:val="1076"/>
         </w:numPr>
       </w:pPr>
       <w:r>
@@ -13635,7 +13968,7 @@
         <w:pStyle w:val="Compact"/>
         <w:numPr>
           <w:ilvl w:val="0"/>
-          <w:numId w:val="1074"/>
+          <w:numId w:val="1076"/>
         </w:numPr>
       </w:pPr>
       <w:r>
@@ -13663,7 +13996,7 @@
         <w:pStyle w:val="Compact"/>
         <w:numPr>
           <w:ilvl w:val="0"/>
-          <w:numId w:val="1074"/>
+          <w:numId w:val="1076"/>
         </w:numPr>
       </w:pPr>
       <w:r>
@@ -13703,7 +14036,7 @@
         <w:pStyle w:val="Compact"/>
         <w:numPr>
           <w:ilvl w:val="0"/>
-          <w:numId w:val="1074"/>
+          <w:numId w:val="1076"/>
         </w:numPr>
       </w:pPr>
       <w:r>
@@ -13770,7 +14103,7 @@
         <w:pStyle w:val="Compact"/>
         <w:numPr>
           <w:ilvl w:val="0"/>
-          <w:numId w:val="1074"/>
+          <w:numId w:val="1076"/>
         </w:numPr>
       </w:pPr>
       <w:r>
@@ -13808,8 +14141,8 @@
         <w:t xml:space="preserve">cross-account sync-state on isolated provider dirs.</w:t>
       </w:r>
     </w:p>
-    <w:bookmarkEnd w:id="104"/>
-    <w:bookmarkStart w:id="105" w:name="X7b6b31a71aa5e1b1df81413a1880ad3edcce6d6"/>
+    <w:bookmarkEnd w:id="107"/>
+    <w:bookmarkStart w:id="108" w:name="X7b6b31a71aa5e1b1df81413a1880ad3edcce6d6"/>
     <w:p>
       <w:pPr>
         <w:pStyle w:val="Heading3"/>
@@ -13823,7 +14156,7 @@
         <w:pStyle w:val="Compact"/>
         <w:numPr>
           <w:ilvl w:val="0"/>
-          <w:numId w:val="1075"/>
+          <w:numId w:val="1077"/>
         </w:numPr>
       </w:pPr>
       <w:r>
@@ -13851,7 +14184,7 @@
         <w:pStyle w:val="Compact"/>
         <w:numPr>
           <w:ilvl w:val="0"/>
-          <w:numId w:val="1075"/>
+          <w:numId w:val="1077"/>
         </w:numPr>
       </w:pPr>
       <w:r>
@@ -13879,7 +14212,7 @@
         <w:pStyle w:val="Compact"/>
         <w:numPr>
           <w:ilvl w:val="0"/>
-          <w:numId w:val="1075"/>
+          <w:numId w:val="1077"/>
         </w:numPr>
       </w:pPr>
       <w:r>
@@ -13892,8 +14225,8 @@
         <w:t xml:space="preserve">honestly; excluded under "valid users only" but kept fully supported.</w:t>
       </w:r>
     </w:p>
-    <w:bookmarkEnd w:id="105"/>
-    <w:bookmarkStart w:id="106" w:name="safety"/>
+    <w:bookmarkEnd w:id="108"/>
+    <w:bookmarkStart w:id="109" w:name="safety"/>
     <w:p>
       <w:pPr>
         <w:pStyle w:val="Heading3"/>
@@ -13907,7 +14240,7 @@
         <w:pStyle w:val="Compact"/>
         <w:numPr>
           <w:ilvl w:val="0"/>
-          <w:numId w:val="1076"/>
+          <w:numId w:val="1078"/>
         </w:numPr>
       </w:pPr>
       <w:r>
@@ -13958,7 +14291,7 @@
         <w:pStyle w:val="Compact"/>
         <w:numPr>
           <w:ilvl w:val="0"/>
-          <w:numId w:val="1076"/>
+          <w:numId w:val="1078"/>
         </w:numPr>
       </w:pPr>
       <w:r>
@@ -13983,9 +14316,9 @@
         <w:t xml:space="preserve">All published ports bound to loopback.</w:t>
       </w:r>
     </w:p>
-    <w:bookmarkEnd w:id="106"/>
-    <w:bookmarkEnd w:id="107"/>
-    <w:bookmarkStart w:id="108" w:name="X0b5e2b6bb8414853f28cab918f1092cceff261f"/>
+    <w:bookmarkEnd w:id="109"/>
+    <w:bookmarkEnd w:id="110"/>
+    <w:bookmarkStart w:id="111" w:name="X0b5e2b6bb8414853f28cab918f1092cceff261f"/>
     <w:p>
       <w:pPr>
         <w:pStyle w:val="Heading2"/>
@@ -14053,8 +14386,8 @@
         <w:t xml:space="preserve">.</w:t>
       </w:r>
     </w:p>
-    <w:bookmarkEnd w:id="108"/>
-    <w:bookmarkStart w:id="112" w:name="X73f1b74114f5ea30e47358e35fb30d0b7a0161a"/>
+    <w:bookmarkEnd w:id="111"/>
+    <w:bookmarkStart w:id="115" w:name="X73f1b74114f5ea30e47358e35fb30d0b7a0161a"/>
     <w:p>
       <w:pPr>
         <w:pStyle w:val="Heading2"/>
@@ -14063,7 +14396,7 @@
         <w:t xml:space="preserve">v1.6.7 — 2026-06-21 — Poe proxy fix for all aliases</w:t>
       </w:r>
     </w:p>
-    <w:bookmarkStart w:id="109" w:name="fixed-12"/>
+    <w:bookmarkStart w:id="112" w:name="fixed-12"/>
     <w:p>
       <w:pPr>
         <w:pStyle w:val="Heading3"/>
@@ -14077,7 +14410,7 @@
         <w:pStyle w:val="Compact"/>
         <w:numPr>
           <w:ilvl w:val="0"/>
-          <w:numId w:val="1077"/>
+          <w:numId w:val="1079"/>
         </w:numPr>
       </w:pPr>
       <w:r>
@@ -14126,7 +14459,7 @@
         <w:pStyle w:val="Compact"/>
         <w:numPr>
           <w:ilvl w:val="0"/>
-          <w:numId w:val="1077"/>
+          <w:numId w:val="1079"/>
         </w:numPr>
       </w:pPr>
       <w:r>
@@ -14154,7 +14487,7 @@
         <w:pStyle w:val="Compact"/>
         <w:numPr>
           <w:ilvl w:val="0"/>
-          <w:numId w:val="1077"/>
+          <w:numId w:val="1079"/>
         </w:numPr>
       </w:pPr>
       <w:r>
@@ -14168,8 +14501,8 @@
         <w:t xml:space="preserve">: same fix applied</w:t>
       </w:r>
     </w:p>
-    <w:bookmarkEnd w:id="109"/>
-    <w:bookmarkStart w:id="110" w:name="verified-11"/>
+    <w:bookmarkEnd w:id="112"/>
+    <w:bookmarkStart w:id="113" w:name="verified-12"/>
     <w:p>
       <w:pPr>
         <w:pStyle w:val="Heading3"/>
@@ -14183,7 +14516,7 @@
         <w:pStyle w:val="Compact"/>
         <w:numPr>
           <w:ilvl w:val="0"/>
-          <w:numId w:val="1078"/>
+          <w:numId w:val="1080"/>
         </w:numPr>
       </w:pPr>
       <w:r>
@@ -14240,15 +14573,15 @@
         <w:pStyle w:val="Compact"/>
         <w:numPr>
           <w:ilvl w:val="0"/>
-          <w:numId w:val="1078"/>
+          <w:numId w:val="1080"/>
         </w:numPr>
       </w:pPr>
       <w:r>
         <w:t xml:space="preserve">Deployed to both local host and nezha.local</w:t>
       </w:r>
     </w:p>
-    <w:bookmarkEnd w:id="110"/>
-    <w:bookmarkStart w:id="111" w:name="tests-5"/>
+    <w:bookmarkEnd w:id="113"/>
+    <w:bookmarkStart w:id="114" w:name="tests-5"/>
     <w:p>
       <w:pPr>
         <w:pStyle w:val="Heading3"/>
@@ -14262,7 +14595,7 @@
         <w:pStyle w:val="Compact"/>
         <w:numPr>
           <w:ilvl w:val="0"/>
-          <w:numId w:val="1079"/>
+          <w:numId w:val="1081"/>
         </w:numPr>
       </w:pPr>
       <w:r>
@@ -14274,16 +14607,16 @@
         <w:pStyle w:val="Compact"/>
         <w:numPr>
           <w:ilvl w:val="0"/>
-          <w:numId w:val="1079"/>
+          <w:numId w:val="1081"/>
         </w:numPr>
       </w:pPr>
       <w:r>
         <w:t xml:space="preserve">nezha.local: 7/8 (pandoc missing — pre-existing)</w:t>
       </w:r>
     </w:p>
-    <w:bookmarkEnd w:id="111"/>
-    <w:bookmarkEnd w:id="112"/>
-    <w:bookmarkStart w:id="116" w:name="v168--2026-06-21--poe-proxy-gzip-fix"/>
+    <w:bookmarkEnd w:id="114"/>
+    <w:bookmarkEnd w:id="115"/>
+    <w:bookmarkStart w:id="119" w:name="v168--2026-06-21--poe-proxy-gzip-fix"/>
     <w:p>
       <w:pPr>
         <w:pStyle w:val="Heading2"/>
@@ -14292,7 +14625,7 @@
         <w:t xml:space="preserve">v1.6.8 — 2026-06-21 — Poe proxy gzip fix</w:t>
       </w:r>
     </w:p>
-    <w:bookmarkStart w:id="113" w:name="fixed-13"/>
+    <w:bookmarkStart w:id="116" w:name="fixed-13"/>
     <w:p>
       <w:pPr>
         <w:pStyle w:val="Heading3"/>
@@ -14306,7 +14639,7 @@
         <w:pStyle w:val="Compact"/>
         <w:numPr>
           <w:ilvl w:val="0"/>
-          <w:numId w:val="1080"/>
+          <w:numId w:val="1082"/>
         </w:numPr>
       </w:pPr>
       <w:r>
@@ -14335,8 +14668,8 @@
         <w:t xml:space="preserve">UnicodeDecodeError. Added gzip decompression for both success and error responses.</w:t>
       </w:r>
     </w:p>
-    <w:bookmarkEnd w:id="113"/>
-    <w:bookmarkStart w:id="114" w:name="verified-12"/>
+    <w:bookmarkEnd w:id="116"/>
+    <w:bookmarkStart w:id="117" w:name="verified-13"/>
     <w:p>
       <w:pPr>
         <w:pStyle w:val="Heading3"/>
@@ -14350,7 +14683,7 @@
         <w:pStyle w:val="Compact"/>
         <w:numPr>
           <w:ilvl w:val="0"/>
-          <w:numId w:val="1081"/>
+          <w:numId w:val="1083"/>
         </w:numPr>
       </w:pPr>
       <w:r>
@@ -14371,7 +14704,7 @@
         <w:pStyle w:val="Compact"/>
         <w:numPr>
           <w:ilvl w:val="0"/>
-          <w:numId w:val="1081"/>
+          <w:numId w:val="1083"/>
         </w:numPr>
       </w:pPr>
       <w:r>
@@ -14392,7 +14725,7 @@
         <w:pStyle w:val="Compact"/>
         <w:numPr>
           <w:ilvl w:val="0"/>
-          <w:numId w:val="1081"/>
+          <w:numId w:val="1083"/>
         </w:numPr>
       </w:pPr>
       <w:r>
@@ -14408,8 +14741,8 @@
         <w:t xml:space="preserve">(grok-4): ❌ Different error (Grok-4 schema validation, not tools format)</w:t>
       </w:r>
     </w:p>
-    <w:bookmarkEnd w:id="114"/>
-    <w:bookmarkStart w:id="115" w:name="tests-6"/>
+    <w:bookmarkEnd w:id="117"/>
+    <w:bookmarkStart w:id="118" w:name="tests-6"/>
     <w:p>
       <w:pPr>
         <w:pStyle w:val="Heading3"/>
@@ -14423,7 +14756,7 @@
         <w:pStyle w:val="Compact"/>
         <w:numPr>
           <w:ilvl w:val="0"/>
-          <w:numId w:val="1082"/>
+          <w:numId w:val="1084"/>
         </w:numPr>
       </w:pPr>
       <w:r>
@@ -14435,16 +14768,16 @@
         <w:pStyle w:val="Compact"/>
         <w:numPr>
           <w:ilvl w:val="0"/>
-          <w:numId w:val="1082"/>
+          <w:numId w:val="1084"/>
         </w:numPr>
       </w:pPr>
       <w:r>
         <w:t xml:space="preserve">nezha.local: 8/8 ALL GREEN</w:t>
       </w:r>
     </w:p>
-    <w:bookmarkEnd w:id="115"/>
-    <w:bookmarkEnd w:id="116"/>
-    <w:bookmarkStart w:id="120" w:name="X6b73aa0a1c0550d32fa078e70116793f37aa5fa"/>
+    <w:bookmarkEnd w:id="118"/>
+    <w:bookmarkEnd w:id="119"/>
+    <w:bookmarkStart w:id="123" w:name="X6b73aa0a1c0550d32fa078e70116793f37aa5fa"/>
     <w:p>
       <w:pPr>
         <w:pStyle w:val="Heading2"/>
@@ -14453,7 +14786,7 @@
         <w:t xml:space="preserve">v1.6.9 — 2026-06-21 — Poe proxy $ref fix for Grok-4</w:t>
       </w:r>
     </w:p>
-    <w:bookmarkStart w:id="117" w:name="fixed-14"/>
+    <w:bookmarkStart w:id="120" w:name="fixed-14"/>
     <w:p>
       <w:pPr>
         <w:pStyle w:val="Heading3"/>
@@ -14467,7 +14800,7 @@
         <w:pStyle w:val="Compact"/>
         <w:numPr>
           <w:ilvl w:val="0"/>
-          <w:numId w:val="1083"/>
+          <w:numId w:val="1085"/>
         </w:numPr>
       </w:pPr>
       <w:r>
@@ -14592,8 +14925,8 @@
         <w:t xml:space="preserve">.</w:t>
       </w:r>
     </w:p>
-    <w:bookmarkEnd w:id="117"/>
-    <w:bookmarkStart w:id="118" w:name="verified-13"/>
+    <w:bookmarkEnd w:id="120"/>
+    <w:bookmarkStart w:id="121" w:name="verified-14"/>
     <w:p>
       <w:pPr>
         <w:pStyle w:val="Heading3"/>
@@ -14607,7 +14940,7 @@
         <w:pStyle w:val="Compact"/>
         <w:numPr>
           <w:ilvl w:val="0"/>
-          <w:numId w:val="1084"/>
+          <w:numId w:val="1086"/>
         </w:numPr>
       </w:pPr>
       <w:r>
@@ -14628,7 +14961,7 @@
         <w:pStyle w:val="Compact"/>
         <w:numPr>
           <w:ilvl w:val="0"/>
-          <w:numId w:val="1084"/>
+          <w:numId w:val="1086"/>
         </w:numPr>
       </w:pPr>
       <w:r>
@@ -14649,7 +14982,7 @@
         <w:pStyle w:val="Compact"/>
         <w:numPr>
           <w:ilvl w:val="0"/>
-          <w:numId w:val="1084"/>
+          <w:numId w:val="1086"/>
         </w:numPr>
       </w:pPr>
       <w:r>
@@ -14665,8 +14998,8 @@
         <w:t xml:space="preserve">(grok-4): ✅ YES (was failing, now works)</w:t>
       </w:r>
     </w:p>
-    <w:bookmarkEnd w:id="118"/>
-    <w:bookmarkStart w:id="119" w:name="tests-7"/>
+    <w:bookmarkEnd w:id="121"/>
+    <w:bookmarkStart w:id="122" w:name="tests-7"/>
     <w:p>
       <w:pPr>
         <w:pStyle w:val="Heading3"/>
@@ -14680,7 +15013,7 @@
         <w:pStyle w:val="Compact"/>
         <w:numPr>
           <w:ilvl w:val="0"/>
-          <w:numId w:val="1085"/>
+          <w:numId w:val="1087"/>
         </w:numPr>
       </w:pPr>
       <w:r>
@@ -14692,16 +15025,16 @@
         <w:pStyle w:val="Compact"/>
         <w:numPr>
           <w:ilvl w:val="0"/>
-          <w:numId w:val="1085"/>
+          <w:numId w:val="1087"/>
         </w:numPr>
       </w:pPr>
       <w:r>
         <w:t xml:space="preserve">nezha.local: 8/8 ALL GREEN</w:t>
       </w:r>
     </w:p>
-    <w:bookmarkEnd w:id="119"/>
-    <w:bookmarkEnd w:id="120"/>
-    <w:bookmarkStart w:id="125" w:name="X0532de1f3a983780b1972dbb21522315aea09e8"/>
+    <w:bookmarkEnd w:id="122"/>
+    <w:bookmarkEnd w:id="123"/>
+    <w:bookmarkStart w:id="128" w:name="X0532de1f3a983780b1972dbb21522315aea09e8"/>
     <w:p>
       <w:pPr>
         <w:pStyle w:val="Heading2"/>
@@ -14710,7 +15043,7 @@
         <w:t xml:space="preserve">v1.7.0 — 2026-06-22 — Poe proxy complete fix (all aliases verified)</w:t>
       </w:r>
     </w:p>
-    <w:bookmarkStart w:id="121" w:name="fixed-15"/>
+    <w:bookmarkStart w:id="124" w:name="fixed-15"/>
     <w:p>
       <w:pPr>
         <w:pStyle w:val="Heading3"/>
@@ -14724,7 +15057,7 @@
         <w:pStyle w:val="Compact"/>
         <w:numPr>
           <w:ilvl w:val="0"/>
-          <w:numId w:val="1086"/>
+          <w:numId w:val="1088"/>
         </w:numPr>
       </w:pPr>
       <w:r>
@@ -14773,7 +15106,7 @@
         <w:pStyle w:val="Compact"/>
         <w:numPr>
           <w:ilvl w:val="0"/>
-          <w:numId w:val="1086"/>
+          <w:numId w:val="1088"/>
         </w:numPr>
       </w:pPr>
       <w:r>
@@ -14790,8 +15123,8 @@
         <w:t xml:space="preserve">now copies proxy scripts during installation (already in place)</w:t>
       </w:r>
     </w:p>
-    <w:bookmarkEnd w:id="121"/>
-    <w:bookmarkStart w:id="122" w:name="X3ca39d2af9b1c1fc71857ee8467886b3e8dc7f9"/>
+    <w:bookmarkEnd w:id="124"/>
+    <w:bookmarkStart w:id="125" w:name="X3ca39d2af9b1c1fc71857ee8467886b3e8dc7f9"/>
     <w:p>
       <w:pPr>
         <w:pStyle w:val="Heading3"/>
@@ -14805,7 +15138,7 @@
         <w:pStyle w:val="Compact"/>
         <w:numPr>
           <w:ilvl w:val="0"/>
-          <w:numId w:val="1087"/>
+          <w:numId w:val="1089"/>
         </w:numPr>
       </w:pPr>
       <w:r>
@@ -14826,7 +15159,7 @@
         <w:pStyle w:val="Compact"/>
         <w:numPr>
           <w:ilvl w:val="0"/>
-          <w:numId w:val="1087"/>
+          <w:numId w:val="1089"/>
         </w:numPr>
       </w:pPr>
       <w:r>
@@ -14847,7 +15180,7 @@
         <w:pStyle w:val="Compact"/>
         <w:numPr>
           <w:ilvl w:val="0"/>
-          <w:numId w:val="1087"/>
+          <w:numId w:val="1089"/>
         </w:numPr>
       </w:pPr>
       <w:r>
@@ -14863,8 +15196,8 @@
         <w:t xml:space="preserve">(grok-4): ✅ YES</w:t>
       </w:r>
     </w:p>
-    <w:bookmarkEnd w:id="122"/>
-    <w:bookmarkStart w:id="123" w:name="root-cause-analysis-1"/>
+    <w:bookmarkEnd w:id="125"/>
+    <w:bookmarkStart w:id="126" w:name="root-cause-analysis-1"/>
     <w:p>
       <w:pPr>
         <w:pStyle w:val="Heading3"/>
@@ -14886,7 +15219,7 @@
         <w:pStyle w:val="Compact"/>
         <w:numPr>
           <w:ilvl w:val="0"/>
-          <w:numId w:val="1088"/>
+          <w:numId w:val="1090"/>
         </w:numPr>
       </w:pPr>
       <w:r>
@@ -14908,7 +15241,7 @@
         <w:pStyle w:val="Compact"/>
         <w:numPr>
           <w:ilvl w:val="0"/>
-          <w:numId w:val="1088"/>
+          <w:numId w:val="1090"/>
         </w:numPr>
       </w:pPr>
       <w:r>
@@ -14930,7 +15263,7 @@
         <w:pStyle w:val="Compact"/>
         <w:numPr>
           <w:ilvl w:val="0"/>
-          <w:numId w:val="1088"/>
+          <w:numId w:val="1090"/>
         </w:numPr>
       </w:pPr>
       <w:r>
@@ -14955,8 +15288,8 @@
         <w:t xml:space="preserve">All three fixed and verified.</w:t>
       </w:r>
     </w:p>
-    <w:bookmarkEnd w:id="123"/>
-    <w:bookmarkStart w:id="124" w:name="tests-8"/>
+    <w:bookmarkEnd w:id="126"/>
+    <w:bookmarkStart w:id="127" w:name="tests-8"/>
     <w:p>
       <w:pPr>
         <w:pStyle w:val="Heading3"/>
@@ -14970,7 +15303,7 @@
         <w:pStyle w:val="Compact"/>
         <w:numPr>
           <w:ilvl w:val="0"/>
-          <w:numId w:val="1089"/>
+          <w:numId w:val="1091"/>
         </w:numPr>
       </w:pPr>
       <w:r>
@@ -14982,16 +15315,16 @@
         <w:pStyle w:val="Compact"/>
         <w:numPr>
           <w:ilvl w:val="0"/>
-          <w:numId w:val="1089"/>
+          <w:numId w:val="1091"/>
         </w:numPr>
       </w:pPr>
       <w:r>
         <w:t xml:space="preserve">nezha.local: 8/8 ALL GREEN</w:t>
       </w:r>
     </w:p>
-    <w:bookmarkEnd w:id="124"/>
-    <w:bookmarkEnd w:id="125"/>
-    <w:bookmarkStart w:id="129" w:name="X6c14826a40db1917917c574b9e01f7f6d201b77"/>
+    <w:bookmarkEnd w:id="127"/>
+    <w:bookmarkEnd w:id="128"/>
+    <w:bookmarkStart w:id="132" w:name="X6c14826a40db1917917c574b9e01f7f6d201b77"/>
     <w:p>
       <w:pPr>
         <w:pStyle w:val="Heading2"/>
@@ -15000,7 +15333,7 @@
         <w:t xml:space="preserve">v1.7.1 — 2026-06-22 — Full validation + release</w:t>
       </w:r>
     </w:p>
-    <w:bookmarkStart w:id="126" w:name="fixed-16"/>
+    <w:bookmarkStart w:id="129" w:name="fixed-16"/>
     <w:p>
       <w:pPr>
         <w:pStyle w:val="Heading3"/>
@@ -15014,7 +15347,7 @@
         <w:pStyle w:val="Compact"/>
         <w:numPr>
           <w:ilvl w:val="0"/>
-          <w:numId w:val="1090"/>
+          <w:numId w:val="1092"/>
         </w:numPr>
       </w:pPr>
       <w:r>
@@ -15066,7 +15399,7 @@
         <w:pStyle w:val="Compact"/>
         <w:numPr>
           <w:ilvl w:val="0"/>
-          <w:numId w:val="1090"/>
+          <w:numId w:val="1092"/>
         </w:numPr>
       </w:pPr>
       <w:r>
@@ -15118,7 +15451,7 @@
         <w:pStyle w:val="Compact"/>
         <w:numPr>
           <w:ilvl w:val="0"/>
-          <w:numId w:val="1090"/>
+          <w:numId w:val="1092"/>
         </w:numPr>
       </w:pPr>
       <w:r>
@@ -15150,8 +15483,8 @@
         <w:t xml:space="preserve">subshell with safe indirect expansion</w:t>
       </w:r>
     </w:p>
-    <w:bookmarkEnd w:id="126"/>
-    <w:bookmarkStart w:id="127" w:name="tests-9"/>
+    <w:bookmarkEnd w:id="129"/>
+    <w:bookmarkStart w:id="130" w:name="tests-9"/>
     <w:p>
       <w:pPr>
         <w:pStyle w:val="Heading3"/>
@@ -15165,7 +15498,7 @@
         <w:pStyle w:val="Compact"/>
         <w:numPr>
           <w:ilvl w:val="0"/>
-          <w:numId w:val="1091"/>
+          <w:numId w:val="1093"/>
         </w:numPr>
       </w:pPr>
       <w:r>
@@ -15193,15 +15526,15 @@
         <w:pStyle w:val="Compact"/>
         <w:numPr>
           <w:ilvl w:val="0"/>
-          <w:numId w:val="1091"/>
+          <w:numId w:val="1093"/>
         </w:numPr>
       </w:pPr>
       <w:r>
         <w:t xml:space="preserve">nezha.local: 8/9 (export fails — pandoc missing)</w:t>
       </w:r>
     </w:p>
-    <w:bookmarkEnd w:id="127"/>
-    <w:bookmarkStart w:id="128" w:name="release"/>
+    <w:bookmarkEnd w:id="130"/>
+    <w:bookmarkStart w:id="131" w:name="release"/>
     <w:p>
       <w:pPr>
         <w:pStyle w:val="Heading3"/>
@@ -15215,154 +15548,154 @@
         <w:pStyle w:val="Compact"/>
         <w:numPr>
           <w:ilvl w:val="0"/>
-          <w:numId w:val="1092"/>
+          <w:numId w:val="1094"/>
         </w:numPr>
       </w:pPr>
       <w:r>
         <w:t xml:space="preserve">v1.7.1 — pushed to github, gitlab, gitflic, gitverse</w:t>
-      </w:r>
-    </w:p>
-    <w:bookmarkEnd w:id="128"/>
-    <w:bookmarkEnd w:id="129"/>
-    <w:bookmarkStart w:id="132" w:name="Xd6116881a80b8b1f65daf8a421c09304e0b327e"/>
-    <w:p>
-      <w:pPr>
-        <w:pStyle w:val="Heading2"/>
-      </w:pPr>
-      <w:r>
-        <w:t xml:space="preserve">v1.7.2 — 2026-06-22 — Claude alias verification, full release</w:t>
-      </w:r>
-    </w:p>
-    <w:bookmarkStart w:id="130" w:name="added-12"/>
-    <w:p>
-      <w:pPr>
-        <w:pStyle w:val="Heading3"/>
-      </w:pPr>
-      <w:r>
-        <w:t xml:space="preserve">Added</w:t>
-      </w:r>
-    </w:p>
-    <w:p>
-      <w:pPr>
-        <w:pStyle w:val="Compact"/>
-        <w:numPr>
-          <w:ilvl w:val="0"/>
-          <w:numId w:val="1093"/>
-        </w:numPr>
-      </w:pPr>
-      <w:r>
-        <w:rPr>
-          <w:b/>
-          <w:bCs/>
-        </w:rPr>
-        <w:t xml:space="preserve">Claude alias verification</w:t>
-      </w:r>
-      <w:r>
-        <w:t xml:space="preserve"> </w:t>
-      </w:r>
-      <w:r>
-        <w:t xml:space="preserve">in verify_aliases_live.sh — tests claude1/2/3</w:t>
-      </w:r>
-      <w:r>
-        <w:t xml:space="preserve"> </w:t>
-      </w:r>
-      <w:r>
-        <w:t xml:space="preserve">alongside provider aliases</w:t>
-      </w:r>
-    </w:p>
-    <w:p>
-      <w:pPr>
-        <w:pStyle w:val="Compact"/>
-        <w:numPr>
-          <w:ilvl w:val="0"/>
-          <w:numId w:val="1093"/>
-        </w:numPr>
-      </w:pPr>
-      <w:r>
-        <w:rPr>
-          <w:b/>
-          <w:bCs/>
-        </w:rPr>
-        <w:t xml:space="preserve">TOON tested</w:t>
-      </w:r>
-      <w:r>
-        <w:t xml:space="preserve"> </w:t>
-      </w:r>
-      <w:r>
-        <w:t xml:space="preserve">on all aliases — verified working</w:t>
-      </w:r>
-    </w:p>
-    <w:bookmarkEnd w:id="130"/>
-    <w:bookmarkStart w:id="131" w:name="tests-10"/>
-    <w:p>
-      <w:pPr>
-        <w:pStyle w:val="Heading3"/>
-      </w:pPr>
-      <w:r>
-        <w:t xml:space="preserve">Tests</w:t>
-      </w:r>
-    </w:p>
-    <w:p>
-      <w:pPr>
-        <w:pStyle w:val="Compact"/>
-        <w:numPr>
-          <w:ilvl w:val="0"/>
-          <w:numId w:val="1094"/>
-        </w:numPr>
-      </w:pPr>
-      <w:r>
-        <w:t xml:space="preserve">Local:</w:t>
-      </w:r>
-      <w:r>
-        <w:t xml:space="preserve"> </w:t>
-      </w:r>
-      <w:r>
-        <w:rPr>
-          <w:b/>
-          <w:bCs/>
-        </w:rPr>
-        <w:t xml:space="preserve">9/9 ALL GREEN</w:t>
-      </w:r>
-    </w:p>
-    <w:p>
-      <w:pPr>
-        <w:pStyle w:val="Compact"/>
-        <w:numPr>
-          <w:ilvl w:val="0"/>
-          <w:numId w:val="1094"/>
-        </w:numPr>
-      </w:pPr>
-      <w:r>
-        <w:t xml:space="preserve">nezha.local: 8/9 (pandoc missing)</w:t>
-      </w:r>
-    </w:p>
-    <w:p>
-      <w:pPr>
-        <w:pStyle w:val="Compact"/>
-        <w:numPr>
-          <w:ilvl w:val="0"/>
-          <w:numId w:val="1094"/>
-        </w:numPr>
-      </w:pPr>
-      <w:r>
-        <w:t xml:space="preserve">All claude1/2/3: ✅ OK</w:t>
-      </w:r>
-    </w:p>
-    <w:p>
-      <w:pPr>
-        <w:pStyle w:val="Compact"/>
-        <w:numPr>
-          <w:ilvl w:val="0"/>
-          <w:numId w:val="1094"/>
-        </w:numPr>
-      </w:pPr>
-      <w:r>
-        <w:t xml:space="preserve">All provider aliases: verified</w:t>
       </w:r>
     </w:p>
     <w:bookmarkEnd w:id="131"/>
     <w:bookmarkEnd w:id="132"/>
+    <w:bookmarkStart w:id="135" w:name="Xd6116881a80b8b1f65daf8a421c09304e0b327e"/>
+    <w:p>
+      <w:pPr>
+        <w:pStyle w:val="Heading2"/>
+      </w:pPr>
+      <w:r>
+        <w:t xml:space="preserve">v1.7.2 — 2026-06-22 — Claude alias verification, full release</w:t>
+      </w:r>
+    </w:p>
+    <w:bookmarkStart w:id="133" w:name="added-13"/>
+    <w:p>
+      <w:pPr>
+        <w:pStyle w:val="Heading3"/>
+      </w:pPr>
+      <w:r>
+        <w:t xml:space="preserve">Added</w:t>
+      </w:r>
+    </w:p>
+    <w:p>
+      <w:pPr>
+        <w:pStyle w:val="Compact"/>
+        <w:numPr>
+          <w:ilvl w:val="0"/>
+          <w:numId w:val="1095"/>
+        </w:numPr>
+      </w:pPr>
+      <w:r>
+        <w:rPr>
+          <w:b/>
+          <w:bCs/>
+        </w:rPr>
+        <w:t xml:space="preserve">Claude alias verification</w:t>
+      </w:r>
+      <w:r>
+        <w:t xml:space="preserve"> </w:t>
+      </w:r>
+      <w:r>
+        <w:t xml:space="preserve">in verify_aliases_live.sh — tests claude1/2/3</w:t>
+      </w:r>
+      <w:r>
+        <w:t xml:space="preserve"> </w:t>
+      </w:r>
+      <w:r>
+        <w:t xml:space="preserve">alongside provider aliases</w:t>
+      </w:r>
+    </w:p>
+    <w:p>
+      <w:pPr>
+        <w:pStyle w:val="Compact"/>
+        <w:numPr>
+          <w:ilvl w:val="0"/>
+          <w:numId w:val="1095"/>
+        </w:numPr>
+      </w:pPr>
+      <w:r>
+        <w:rPr>
+          <w:b/>
+          <w:bCs/>
+        </w:rPr>
+        <w:t xml:space="preserve">TOON tested</w:t>
+      </w:r>
+      <w:r>
+        <w:t xml:space="preserve"> </w:t>
+      </w:r>
+      <w:r>
+        <w:t xml:space="preserve">on all aliases — verified working</w:t>
+      </w:r>
+    </w:p>
     <w:bookmarkEnd w:id="133"/>
+    <w:bookmarkStart w:id="134" w:name="tests-10"/>
+    <w:p>
+      <w:pPr>
+        <w:pStyle w:val="Heading3"/>
+      </w:pPr>
+      <w:r>
+        <w:t xml:space="preserve">Tests</w:t>
+      </w:r>
+    </w:p>
+    <w:p>
+      <w:pPr>
+        <w:pStyle w:val="Compact"/>
+        <w:numPr>
+          <w:ilvl w:val="0"/>
+          <w:numId w:val="1096"/>
+        </w:numPr>
+      </w:pPr>
+      <w:r>
+        <w:t xml:space="preserve">Local:</w:t>
+      </w:r>
+      <w:r>
+        <w:t xml:space="preserve"> </w:t>
+      </w:r>
+      <w:r>
+        <w:rPr>
+          <w:b/>
+          <w:bCs/>
+        </w:rPr>
+        <w:t xml:space="preserve">9/9 ALL GREEN</w:t>
+      </w:r>
+    </w:p>
+    <w:p>
+      <w:pPr>
+        <w:pStyle w:val="Compact"/>
+        <w:numPr>
+          <w:ilvl w:val="0"/>
+          <w:numId w:val="1096"/>
+        </w:numPr>
+      </w:pPr>
+      <w:r>
+        <w:t xml:space="preserve">nezha.local: 8/9 (pandoc missing)</w:t>
+      </w:r>
+    </w:p>
+    <w:p>
+      <w:pPr>
+        <w:pStyle w:val="Compact"/>
+        <w:numPr>
+          <w:ilvl w:val="0"/>
+          <w:numId w:val="1096"/>
+        </w:numPr>
+      </w:pPr>
+      <w:r>
+        <w:t xml:space="preserve">All claude1/2/3: ✅ OK</w:t>
+      </w:r>
+    </w:p>
+    <w:p>
+      <w:pPr>
+        <w:pStyle w:val="Compact"/>
+        <w:numPr>
+          <w:ilvl w:val="0"/>
+          <w:numId w:val="1096"/>
+        </w:numPr>
+      </w:pPr>
+      <w:r>
+        <w:t xml:space="preserve">All provider aliases: verified</w:t>
+      </w:r>
+    </w:p>
+    <w:bookmarkEnd w:id="134"/>
+    <w:bookmarkEnd w:id="135"/>
+    <w:bookmarkEnd w:id="136"/>
     <w:sectPr>
       <w:footnotePr>
         <w:numRestart w:val="eachSect"/>
@@ -15740,6 +16073,12 @@
     <w:abstractNumId w:val="991"/>
   </w:num>
   <w:num w:numId="1026">
+    <w:abstractNumId w:val="991"/>
+  </w:num>
+  <w:num w:numId="1027">
+    <w:abstractNumId w:val="991"/>
+  </w:num>
+  <w:num w:numId="1028">
     <w:abstractNumId w:val="99411"/>
     <w:lvlOverride w:ilvl="0">
       <w:startOverride w:val="1"/>
@@ -15768,12 +16107,6 @@
     <w:lvlOverride w:ilvl="8">
       <w:startOverride w:val="1"/>
     </w:lvlOverride>
-  </w:num>
-  <w:num w:numId="1027">
-    <w:abstractNumId w:val="991"/>
-  </w:num>
-  <w:num w:numId="1028">
-    <w:abstractNumId w:val="991"/>
   </w:num>
   <w:num w:numId="1029">
     <w:abstractNumId w:val="991"/>
@@ -15860,6 +16193,12 @@
     <w:abstractNumId w:val="991"/>
   </w:num>
   <w:num w:numId="1057">
+    <w:abstractNumId w:val="991"/>
+  </w:num>
+  <w:num w:numId="1058">
+    <w:abstractNumId w:val="991"/>
+  </w:num>
+  <w:num w:numId="1059">
     <w:abstractNumId w:val="99411"/>
     <w:lvlOverride w:ilvl="0">
       <w:startOverride w:val="1"/>
@@ -15888,12 +16227,6 @@
     <w:lvlOverride w:ilvl="8">
       <w:startOverride w:val="1"/>
     </w:lvlOverride>
-  </w:num>
-  <w:num w:numId="1058">
-    <w:abstractNumId w:val="991"/>
-  </w:num>
-  <w:num w:numId="1059">
-    <w:abstractNumId w:val="991"/>
   </w:num>
   <w:num w:numId="1060">
     <w:abstractNumId w:val="991"/>
@@ -15980,6 +16313,12 @@
     <w:abstractNumId w:val="991"/>
   </w:num>
   <w:num w:numId="1088">
+    <w:abstractNumId w:val="991"/>
+  </w:num>
+  <w:num w:numId="1089">
+    <w:abstractNumId w:val="991"/>
+  </w:num>
+  <w:num w:numId="1090">
     <w:abstractNumId w:val="99411"/>
     <w:lvlOverride w:ilvl="0">
       <w:startOverride w:val="1"/>
@@ -16009,12 +16348,6 @@
       <w:startOverride w:val="1"/>
     </w:lvlOverride>
   </w:num>
-  <w:num w:numId="1089">
-    <w:abstractNumId w:val="991"/>
-  </w:num>
-  <w:num w:numId="1090">
-    <w:abstractNumId w:val="991"/>
-  </w:num>
   <w:num w:numId="1091">
     <w:abstractNumId w:val="991"/>
   </w:num>
@@ -16025,6 +16358,12 @@
     <w:abstractNumId w:val="991"/>
   </w:num>
   <w:num w:numId="1094">
+    <w:abstractNumId w:val="991"/>
+  </w:num>
+  <w:num w:numId="1095">
+    <w:abstractNumId w:val="991"/>
+  </w:num>
+  <w:num w:numId="1096">
     <w:abstractNumId w:val="991"/>
   </w:num>
 </w:numbering>

</xml_diff>

<commit_message>
docs(release): live provider-alias verification evidence for v1.23.0 (no bluff)
With api_keys.sh present, claude-providers sync + the run-proof alias legs
verify 10-11 aliases LIVE end-to-end. The remaining providers are honestly gated
— every failure is ACCOUNT-SIDE, proven by direct HTTP probes captured in
scripts/tests/proof/60-provider-triage.txt: 401 (keys rejected; keyvar mappings
verified correct), 402/403 (no funds / suspended / quota), 429 (fair-usage
rate-limit / insufficient balance). No toolkit config bug. `claude-providers
prune` removed 3 stale status-only orphans. The launch gate refuses every
non-verified alias — anti-bluff working as intended. CHANGELOG v1.23.0 "Verified"
section updated + siblings regenerated.

Co-Authored-By: Claude Opus 4.8 <noreply@anthropic.com>
</commit_message>
<xml_diff>
--- a/CHANGELOG.docx
+++ b/CHANGELOG.docx
@@ -682,7 +682,7 @@
         <w:t xml:space="preserve"> </w:t>
       </w:r>
       <w:r>
-        <w:t xml:space="preserve">ALL GREEN (live provider legs SKIP-OK without keys);</w:t>
+        <w:t xml:space="preserve">ALL GREEN;</w:t>
       </w:r>
       <w:r>
         <w:t xml:space="preserve"> </w:t>
@@ -697,13 +697,7 @@
         <w:t xml:space="preserve"> </w:t>
       </w:r>
       <w:r>
-        <w:t xml:space="preserve">—</w:t>
-      </w:r>
-      <w:r>
-        <w:t xml:space="preserve"> </w:t>
-      </w:r>
-      <w:r>
-        <w:t xml:space="preserve">49/0;</w:t>
+        <w:t xml:space="preserve">— 49/0;</w:t>
       </w:r>
       <w:r>
         <w:t xml:space="preserve"> </w:t>
@@ -809,6 +803,194 @@
       </w:r>
       <w:r>
         <w:t xml:space="preserve">GREEN.</w:t>
+      </w:r>
+    </w:p>
+    <w:p>
+      <w:pPr>
+        <w:pStyle w:val="Compact"/>
+        <w:numPr>
+          <w:ilvl w:val="0"/>
+          <w:numId w:val="1003"/>
+        </w:numPr>
+      </w:pPr>
+      <w:r>
+        <w:rPr>
+          <w:b/>
+          <w:bCs/>
+        </w:rPr>
+        <w:t xml:space="preserve">Live provider aliases</w:t>
+      </w:r>
+      <w:r>
+        <w:t xml:space="preserve"> </w:t>
+      </w:r>
+      <w:r>
+        <w:t xml:space="preserve">(</w:t>
+      </w:r>
+      <w:r>
+        <w:rPr>
+          <w:rStyle w:val="VerbatimChar"/>
+        </w:rPr>
+        <w:t xml:space="preserve">api_keys.sh</w:t>
+      </w:r>
+      <w:r>
+        <w:t xml:space="preserve"> </w:t>
+      </w:r>
+      <w:r>
+        <w:t xml:space="preserve">present):</w:t>
+      </w:r>
+      <w:r>
+        <w:t xml:space="preserve"> </w:t>
+      </w:r>
+      <w:r>
+        <w:rPr>
+          <w:rStyle w:val="VerbatimChar"/>
+        </w:rPr>
+        <w:t xml:space="preserve">claude-providers sync</w:t>
+      </w:r>
+      <w:r>
+        <w:t xml:space="preserve"> </w:t>
+      </w:r>
+      <w:r>
+        <w:t xml:space="preserve">+</w:t>
+      </w:r>
+      <w:r>
+        <w:t xml:space="preserve"> </w:t>
+      </w:r>
+      <w:r>
+        <w:t xml:space="preserve">the</w:t>
+      </w:r>
+      <w:r>
+        <w:t xml:space="preserve"> </w:t>
+      </w:r>
+      <w:r>
+        <w:rPr>
+          <w:rStyle w:val="VerbatimChar"/>
+        </w:rPr>
+        <w:t xml:space="preserve">run-proof</w:t>
+      </w:r>
+      <w:r>
+        <w:t xml:space="preserve"> </w:t>
+      </w:r>
+      <w:r>
+        <w:t xml:space="preserve">alias legs verify</w:t>
+      </w:r>
+      <w:r>
+        <w:t xml:space="preserve"> </w:t>
+      </w:r>
+      <w:r>
+        <w:rPr>
+          <w:b/>
+          <w:bCs/>
+        </w:rPr>
+        <w:t xml:space="preserve">10–11 aliases LIVE</w:t>
+      </w:r>
+      <w:r>
+        <w:t xml:space="preserve"> </w:t>
+      </w:r>
+      <w:r>
+        <w:t xml:space="preserve">end-to-end (chutes,</w:t>
+      </w:r>
+      <w:r>
+        <w:t xml:space="preserve"> </w:t>
+      </w:r>
+      <w:r>
+        <w:t xml:space="preserve">deepseek, helixagent, inference, kilo, opencode, openrouter, poe, siliconflow,</w:t>
+      </w:r>
+      <w:r>
+        <w:t xml:space="preserve"> </w:t>
+      </w:r>
+      <w:r>
+        <w:t xml:space="preserve">xiaomi; nvidia works at HTTP 200 but the strict 2-probe verify intermittently</w:t>
+      </w:r>
+      <w:r>
+        <w:t xml:space="preserve"> </w:t>
+      </w:r>
+      <w:r>
+        <w:t xml:space="preserve">hits free-tier rate-limiting). The remaining providers are</w:t>
+      </w:r>
+      <w:r>
+        <w:t xml:space="preserve"> </w:t>
+      </w:r>
+      <w:r>
+        <w:rPr>
+          <w:b/>
+          <w:bCs/>
+        </w:rPr>
+        <w:t xml:space="preserve">honestly gated —</w:t>
+      </w:r>
+      <w:r>
+        <w:rPr>
+          <w:b/>
+          <w:bCs/>
+        </w:rPr>
+        <w:t xml:space="preserve"> </w:t>
+      </w:r>
+      <w:r>
+        <w:rPr>
+          <w:b/>
+          <w:bCs/>
+        </w:rPr>
+        <w:t xml:space="preserve">every failure is account-side, not a toolkit bug</w:t>
+      </w:r>
+      <w:r>
+        <w:t xml:space="preserve">: direct probes captured</w:t>
+      </w:r>
+      <w:r>
+        <w:t xml:space="preserve"> </w:t>
+      </w:r>
+      <w:r>
+        <w:t xml:space="preserve">401 (key rejected — mappings verified correct), 402/403 (no funds / suspended /</w:t>
+      </w:r>
+      <w:r>
+        <w:t xml:space="preserve"> </w:t>
+      </w:r>
+      <w:r>
+        <w:t xml:space="preserve">quota), 429 (fair-usage rate-limit / insufficient balance). Evidence:</w:t>
+      </w:r>
+      <w:r>
+        <w:t xml:space="preserve"> </w:t>
+      </w:r>
+      <w:r>
+        <w:rPr>
+          <w:rStyle w:val="VerbatimChar"/>
+        </w:rPr>
+        <w:t xml:space="preserve">scripts/tests/proof/60-provider-triage.txt</w:t>
+      </w:r>
+      <w:r>
+        <w:t xml:space="preserve">.</w:t>
+      </w:r>
+      <w:r>
+        <w:t xml:space="preserve"> </w:t>
+      </w:r>
+      <w:r>
+        <w:rPr>
+          <w:rStyle w:val="VerbatimChar"/>
+        </w:rPr>
+        <w:t xml:space="preserve">claude-providers prune</w:t>
+      </w:r>
+      <w:r>
+        <w:t xml:space="preserve"> </w:t>
+      </w:r>
+      <w:r>
+        <w:t xml:space="preserve">removed</w:t>
+      </w:r>
+      <w:r>
+        <w:t xml:space="preserve"> </w:t>
+      </w:r>
+      <w:r>
+        <w:t xml:space="preserve">3 stale status-only orphans. The launch gate refuses every non-</w:t>
+      </w:r>
+      <w:r>
+        <w:rPr>
+          <w:rStyle w:val="VerbatimChar"/>
+        </w:rPr>
+        <w:t xml:space="preserve">verified</w:t>
+      </w:r>
+      <w:r>
+        <w:t xml:space="preserve"> </w:t>
+      </w:r>
+      <w:r>
+        <w:t xml:space="preserve">alias — the anti-bluff design working as intended.</w:t>
       </w:r>
     </w:p>
     <w:p>

</xml_diff>